<commit_message>
Update portfolio links and resume
Co-authored-by: Copilot <223556219+Copilot@users.noreply.github.com>
</commit_message>
<xml_diff>
--- a/assets/Beldad_Resume.docx
+++ b/assets/Beldad_Resume.docx
@@ -16,7 +16,7 @@
         <mc:AlternateContent>
           <mc:Choice Requires="wps">
             <w:drawing>
-              <wp:anchor distT="0" distB="0" distL="114300" distR="114300" simplePos="0" relativeHeight="251722752" behindDoc="1" locked="0" layoutInCell="1" allowOverlap="1" wp14:anchorId="731D134A" wp14:editId="6318A2BE">
+              <wp:anchor distT="0" distB="0" distL="114300" distR="114300" simplePos="0" relativeHeight="251676672" behindDoc="1" locked="0" layoutInCell="1" allowOverlap="1" wp14:anchorId="0817E2C8" wp14:editId="1763B74D">
                 <wp:simplePos x="0" y="0"/>
                 <wp:positionH relativeFrom="column">
                   <wp:posOffset>-84506</wp:posOffset>
@@ -88,7 +88,7 @@
           </mc:Choice>
           <mc:Fallback>
             <w:pict>
-              <v:oval w14:anchorId="10B204E7" id="Oval 16" o:spid="_x0000_s1026" style="position:absolute;margin-left:-6.65pt;margin-top:6.9pt;width:129.85pt;height:129.3pt;z-index:-251593728;visibility:visible;mso-wrap-style:square;mso-height-percent:0;mso-wrap-distance-left:9pt;mso-wrap-distance-top:0;mso-wrap-distance-right:9pt;mso-wrap-distance-bottom:0;mso-position-horizontal:absolute;mso-position-horizontal-relative:text;mso-position-vertical:absolute;mso-position-vertical-relative:text;mso-height-percent:0;mso-height-relative:margin;v-text-anchor:middle" o:gfxdata="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" strokecolor="#0d0d0d [484]" strokeweight="1pt">
+              <v:oval w14:anchorId="0DDD7464" id="Oval 16" o:spid="_x0000_s1026" style="position:absolute;margin-left:-6.65pt;margin-top:6.9pt;width:129.85pt;height:129.3pt;z-index:-251639808;visibility:visible;mso-wrap-style:square;mso-height-percent:0;mso-wrap-distance-left:9pt;mso-wrap-distance-top:0;mso-wrap-distance-right:9pt;mso-wrap-distance-bottom:0;mso-position-horizontal:absolute;mso-position-horizontal-relative:text;mso-position-vertical:absolute;mso-position-vertical-relative:text;mso-height-percent:0;mso-height-relative:margin;v-text-anchor:middle" o:gfxdata="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" strokecolor="#0d0d0d [484]" strokeweight="1pt">
                 <v:fill r:id="rId10" o:title="" recolor="t" rotate="t" type="frame"/>
                 <v:stroke joinstyle="miter"/>
               </v:oval>
@@ -104,13 +104,13 @@
         <mc:AlternateContent>
           <mc:Choice Requires="wps">
             <w:drawing>
-              <wp:anchor distT="45720" distB="45720" distL="114300" distR="114300" simplePos="0" relativeHeight="251712512" behindDoc="0" locked="1" layoutInCell="1" allowOverlap="1" wp14:anchorId="4C69F93C" wp14:editId="59A6445A">
+              <wp:anchor distT="45720" distB="45720" distL="114300" distR="114300" simplePos="0" relativeHeight="251669504" behindDoc="0" locked="1" layoutInCell="1" allowOverlap="1" wp14:anchorId="677BB1A1" wp14:editId="0F5A5139">
                 <wp:simplePos x="0" y="0"/>
                 <wp:positionH relativeFrom="page">
-                  <wp:posOffset>2749550</wp:posOffset>
+                  <wp:posOffset>2730500</wp:posOffset>
                 </wp:positionH>
                 <wp:positionV relativeFrom="page">
-                  <wp:posOffset>901700</wp:posOffset>
+                  <wp:posOffset>1225550</wp:posOffset>
                 </wp:positionV>
                 <wp:extent cx="4483100" cy="812800"/>
                 <wp:effectExtent l="0" t="0" r="0" b="6350"/>
@@ -165,6 +165,12 @@
                               </w:rPr>
                               <w:t xml:space="preserve">Portfolio: </w:t>
                             </w:r>
+                            <w:r>
+                              <w:rPr>
+                                <w:sz w:val="17"/>
+                              </w:rPr>
+                              <w:t>jvbb.vercel.app</w:t>
+                            </w:r>
                           </w:p>
                         </w:txbxContent>
                       </wps:txbx>
@@ -185,11 +191,11 @@
           </mc:Choice>
           <mc:Fallback>
             <w:pict>
-              <v:shapetype w14:anchorId="4C69F93C" id="_x0000_t202" coordsize="21600,21600" o:spt="202" path="m,l,21600r21600,l21600,xe">
+              <v:shapetype w14:anchorId="677BB1A1" id="_x0000_t202" coordsize="21600,21600" o:spt="202" path="m,l,21600r21600,l21600,xe">
                 <v:stroke joinstyle="miter"/>
                 <v:path gradientshapeok="t" o:connecttype="rect"/>
               </v:shapetype>
-              <v:shape id="Text Box 1966648735" o:spid="_x0000_s1026" type="#_x0000_t202" style="position:absolute;left:0;text-align:left;margin-left:216.5pt;margin-top:71pt;width:353pt;height:64pt;z-index:251712512;visibility:visible;mso-wrap-style:square;mso-width-percent:0;mso-height-percent:0;mso-wrap-distance-left:9pt;mso-wrap-distance-top:3.6pt;mso-wrap-distance-right:9pt;mso-wrap-distance-bottom:3.6pt;mso-position-horizontal:absolute;mso-position-horizontal-relative:page;mso-position-vertical:absolute;mso-position-vertical-relative:page;mso-width-percent:0;mso-height-percent:0;mso-width-relative:margin;mso-height-relative:margin;v-text-anchor:top" o:gfxdata="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" filled="f" stroked="f">
+              <v:shape id="Text Box 1966648735" o:spid="_x0000_s1026" type="#_x0000_t202" style="position:absolute;left:0;text-align:left;margin-left:215pt;margin-top:96.5pt;width:353pt;height:64pt;z-index:251669504;visibility:visible;mso-wrap-style:square;mso-width-percent:0;mso-height-percent:0;mso-wrap-distance-left:9pt;mso-wrap-distance-top:3.6pt;mso-wrap-distance-right:9pt;mso-wrap-distance-bottom:3.6pt;mso-position-horizontal:absolute;mso-position-horizontal-relative:page;mso-position-vertical:absolute;mso-position-vertical-relative:page;mso-width-percent:0;mso-height-percent:0;mso-width-relative:margin;mso-height-relative:margin;v-text-anchor:top" o:gfxdata="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" filled="f" stroked="f">
                 <v:textbox>
                   <w:txbxContent>
                     <w:p>
@@ -213,6 +219,12 @@
                           <w:sz w:val="17"/>
                         </w:rPr>
                         <w:t xml:space="preserve">Portfolio: </w:t>
+                      </w:r>
+                      <w:r>
+                        <w:rPr>
+                          <w:sz w:val="17"/>
+                        </w:rPr>
+                        <w:t>jvbb.vercel.app</w:t>
                       </w:r>
                     </w:p>
                   </w:txbxContent>
@@ -232,15 +244,15 @@
         <mc:AlternateContent>
           <mc:Choice Requires="wps">
             <w:drawing>
-              <wp:anchor distT="45720" distB="45720" distL="114300" distR="114300" simplePos="0" relativeHeight="251705344" behindDoc="0" locked="1" layoutInCell="1" allowOverlap="1" wp14:anchorId="38ECC939" wp14:editId="652A759F">
+              <wp:anchor distT="45720" distB="45720" distL="114300" distR="114300" simplePos="0" relativeHeight="251665408" behindDoc="0" locked="1" layoutInCell="1" allowOverlap="1" wp14:anchorId="16EAA21F" wp14:editId="425A2B65">
                 <wp:simplePos x="0" y="0"/>
                 <wp:positionH relativeFrom="page">
-                  <wp:posOffset>317500</wp:posOffset>
+                  <wp:posOffset>257175</wp:posOffset>
                 </wp:positionH>
                 <wp:positionV relativeFrom="page">
-                  <wp:posOffset>3879850</wp:posOffset>
+                  <wp:posOffset>3762375</wp:posOffset>
                 </wp:positionV>
-                <wp:extent cx="1860550" cy="3962400"/>
+                <wp:extent cx="2012950" cy="3108960"/>
                 <wp:effectExtent l="0" t="0" r="0" b="0"/>
                 <wp:wrapSquare wrapText="bothSides"/>
                 <wp:docPr id="29" name="Text Box 29"/>
@@ -256,7 +268,7 @@
                       <wps:spPr bwMode="auto">
                         <a:xfrm>
                           <a:off x="0" y="0"/>
-                          <a:ext cx="1860550" cy="3962400"/>
+                          <a:ext cx="2012950" cy="3108960"/>
                         </a:xfrm>
                         <a:prstGeom prst="rect">
                           <a:avLst/>
@@ -292,7 +304,7 @@
                             </w:r>
                             <w:r>
                               <w:br/>
-                              <w:t>PHINMA University of Iloilo | 2022–Present |</w:t>
+                              <w:t>PHINMA University of Iloilo | 2023–Present |</w:t>
                             </w:r>
                           </w:p>
                           <w:p>
@@ -301,7 +313,7 @@
                               <w:spacing w:after="20"/>
                             </w:pPr>
                             <w:r>
-                              <w:t xml:space="preserve"> ExpectedGraduation:2027</w:t>
+                              <w:t xml:space="preserve"> Expected Graduation: 2027</w:t>
                             </w:r>
                           </w:p>
                           <w:p>
@@ -333,13 +345,7 @@
                             </w:r>
                             <w:proofErr w:type="spellEnd"/>
                             <w:r>
-                              <w:t xml:space="preserve"> National High S</w:t>
-                            </w:r>
-                            <w:r>
-                              <w:t xml:space="preserve">chool </w:t>
-                            </w:r>
-                            <w:r>
-                              <w:t>| 2020–2022</w:t>
+                              <w:t xml:space="preserve"> National High School | 2022–2023</w:t>
                             </w:r>
                           </w:p>
                           <w:p>
@@ -362,8 +368,21 @@
                             </w:r>
                           </w:p>
                           <w:p>
-                            <w:r>
-                              <w:t>San Jose Elementary School</w:t>
+                            <w:proofErr w:type="spellStart"/>
+                            <w:r>
+                              <w:t>Batad</w:t>
+                            </w:r>
+                            <w:proofErr w:type="spellEnd"/>
+                            <w:r>
+                              <w:t xml:space="preserve"> Central School</w:t>
+                            </w:r>
+                          </w:p>
+                          <w:p>
+                            <w:pPr>
+                              <w:pStyle w:val="Normalleftpanel"/>
+                            </w:pPr>
+                            <w:r>
+                              <w:t>| 2011–2017</w:t>
                             </w:r>
                           </w:p>
                           <w:p/>
@@ -386,7 +405,7 @@
           </mc:Choice>
           <mc:Fallback>
             <w:pict>
-              <v:shape w14:anchorId="38ECC939" id="Text Box 29" o:spid="_x0000_s1027" type="#_x0000_t202" style="position:absolute;left:0;text-align:left;margin-left:25pt;margin-top:305.5pt;width:146.5pt;height:312pt;z-index:251705344;visibility:visible;mso-wrap-style:square;mso-width-percent:0;mso-height-percent:0;mso-wrap-distance-left:9pt;mso-wrap-distance-top:3.6pt;mso-wrap-distance-right:9pt;mso-wrap-distance-bottom:3.6pt;mso-position-horizontal:absolute;mso-position-horizontal-relative:page;mso-position-vertical:absolute;mso-position-vertical-relative:page;mso-width-percent:0;mso-height-percent:0;mso-width-relative:margin;mso-height-relative:margin;v-text-anchor:top" o:gfxdata="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" filled="f" stroked="f">
+              <v:shape w14:anchorId="16EAA21F" id="Text Box 29" o:spid="_x0000_s1027" type="#_x0000_t202" style="position:absolute;left:0;text-align:left;margin-left:20.25pt;margin-top:296.25pt;width:158.5pt;height:244.8pt;z-index:251665408;visibility:visible;mso-wrap-style:square;mso-width-percent:0;mso-height-percent:0;mso-wrap-distance-left:9pt;mso-wrap-distance-top:3.6pt;mso-wrap-distance-right:9pt;mso-wrap-distance-bottom:3.6pt;mso-position-horizontal:absolute;mso-position-horizontal-relative:page;mso-position-vertical:absolute;mso-position-vertical-relative:page;mso-width-percent:0;mso-height-percent:0;mso-width-relative:margin;mso-height-relative:margin;v-text-anchor:top" o:gfxdata="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" filled="f" stroked="f">
                 <v:textbox>
                   <w:txbxContent>
                     <w:p>
@@ -410,7 +429,7 @@
                       </w:r>
                       <w:r>
                         <w:br/>
-                        <w:t>PHINMA University of Iloilo | 2022–Present |</w:t>
+                        <w:t>PHINMA University of Iloilo | 2023–Present |</w:t>
                       </w:r>
                     </w:p>
                     <w:p>
@@ -419,7 +438,7 @@
                         <w:spacing w:after="20"/>
                       </w:pPr>
                       <w:r>
-                        <w:t xml:space="preserve"> ExpectedGraduation:2027</w:t>
+                        <w:t xml:space="preserve"> Expected Graduation: 2027</w:t>
                       </w:r>
                     </w:p>
                     <w:p>
@@ -451,13 +470,7 @@
                       </w:r>
                       <w:proofErr w:type="spellEnd"/>
                       <w:r>
-                        <w:t xml:space="preserve"> National High S</w:t>
-                      </w:r>
-                      <w:r>
-                        <w:t xml:space="preserve">chool </w:t>
-                      </w:r>
-                      <w:r>
-                        <w:t>| 2020–2022</w:t>
+                        <w:t xml:space="preserve"> National High School | 2022–2023</w:t>
                       </w:r>
                     </w:p>
                     <w:p>
@@ -480,8 +493,21 @@
                       </w:r>
                     </w:p>
                     <w:p>
-                      <w:r>
-                        <w:t>San Jose Elementary School</w:t>
+                      <w:proofErr w:type="spellStart"/>
+                      <w:r>
+                        <w:t>Batad</w:t>
+                      </w:r>
+                      <w:proofErr w:type="spellEnd"/>
+                      <w:r>
+                        <w:t xml:space="preserve"> Central School</w:t>
+                      </w:r>
+                    </w:p>
+                    <w:p>
+                      <w:pPr>
+                        <w:pStyle w:val="Normalleftpanel"/>
+                      </w:pPr>
+                      <w:r>
+                        <w:t>| 2011–2017</w:t>
                       </w:r>
                     </w:p>
                     <w:p/>
@@ -502,17 +528,17 @@
         <mc:AlternateContent>
           <mc:Choice Requires="wps">
             <w:drawing>
-              <wp:anchor distT="45720" distB="45720" distL="114300" distR="114300" simplePos="0" relativeHeight="251707392" behindDoc="0" locked="1" layoutInCell="1" allowOverlap="1" wp14:anchorId="25BDAFA6" wp14:editId="431382BF">
+              <wp:anchor distT="45720" distB="45720" distL="114300" distR="114300" simplePos="0" relativeHeight="251666432" behindDoc="0" locked="1" layoutInCell="1" allowOverlap="1" wp14:anchorId="183F9B02" wp14:editId="5B2A62FB">
                 <wp:simplePos x="0" y="0"/>
                 <wp:positionH relativeFrom="page">
                   <wp:posOffset>158750</wp:posOffset>
                 </wp:positionH>
                 <wp:positionV relativeFrom="page">
-                  <wp:posOffset>6870700</wp:posOffset>
+                  <wp:posOffset>6686550</wp:posOffset>
                 </wp:positionV>
-                <wp:extent cx="2152650" cy="3111500"/>
+                <wp:extent cx="2152650" cy="4126230"/>
                 <wp:effectExtent l="0" t="0" r="0" b="0"/>
-                <wp:wrapSquare wrapText="bothSides"/>
+                <wp:wrapNone/>
                 <wp:docPr id="27" name="Text Box 27"/>
                 <wp:cNvGraphicFramePr>
                   <a:graphicFrameLocks xmlns:a="http://schemas.openxmlformats.org/drawingml/2006/main"/>
@@ -526,7 +552,7 @@
                       <wps:spPr bwMode="auto">
                         <a:xfrm>
                           <a:off x="0" y="0"/>
-                          <a:ext cx="2152650" cy="3111500"/>
+                          <a:ext cx="2152650" cy="4126230"/>
                         </a:xfrm>
                         <a:prstGeom prst="rect">
                           <a:avLst/>
@@ -554,27 +580,20 @@
                                 <w:sz w:val="24"/>
                                 <w:szCs w:val="24"/>
                               </w:rPr>
-                              <w:t>Ac</w:t>
+                              <w:t>AcADEMIC</w:t>
                             </w:r>
                             <w:r>
                               <w:rPr>
                                 <w:sz w:val="24"/>
                                 <w:szCs w:val="24"/>
                               </w:rPr>
-                              <w:t>ADEMIC</w:t>
+                              <w:t xml:space="preserve"> </w:t>
                             </w:r>
                             <w:r>
                               <w:rPr>
                                 <w:sz w:val="24"/>
                                 <w:szCs w:val="24"/>
                               </w:rPr>
-                              <w:t xml:space="preserve"> </w:t>
-                            </w:r>
-                            <w:r>
-                              <w:rPr>
-                                <w:sz w:val="24"/>
-                                <w:szCs w:val="24"/>
-                              </w:rPr>
                               <w:t>PROJECTS</w:t>
                             </w:r>
                           </w:p>
@@ -589,71 +608,55 @@
                               <w:rPr>
                                 <w:b/>
                               </w:rPr>
-                              <w:t xml:space="preserve">ID Management System </w:t>
-                            </w:r>
+                              <w:t xml:space="preserve">ID Management System – </w:t>
+                            </w:r>
+                            <w:r>
+                              <w:t>Make an ID managing system where student can apply to get their ID.</w:t>
+                            </w:r>
+                          </w:p>
+                          <w:p>
+                            <w:pPr>
+                              <w:spacing w:after="20"/>
+                            </w:pPr>
                             <w:r>
                               <w:rPr>
                                 <w:b/>
                               </w:rPr>
-                              <w:t>–</w:t>
-                            </w:r>
+                              <w:t xml:space="preserve">The Daily Grind – </w:t>
+                            </w:r>
+                            <w:r>
+                              <w:t>Make an ecommerce that have a responsive website using PHP.</w:t>
+                            </w:r>
+                          </w:p>
+                          <w:p>
+                            <w:pPr>
+                              <w:spacing w:after="20"/>
+                            </w:pPr>
+                            <w:proofErr w:type="spellStart"/>
                             <w:r>
                               <w:rPr>
                                 <w:b/>
                               </w:rPr>
-                              <w:t xml:space="preserve"> </w:t>
-                            </w:r>
-                            <w:r>
-                              <w:t xml:space="preserve">Make </w:t>
-                            </w:r>
-                            <w:proofErr w:type="gramStart"/>
-                            <w:r>
-                              <w:t>a</w:t>
-                            </w:r>
-                            <w:proofErr w:type="gramEnd"/>
-                            <w:r>
-                              <w:t xml:space="preserve"> ID managing system where student can apply to get </w:t>
-                            </w:r>
-                            <w:r>
-                              <w:t>their</w:t>
-                            </w:r>
-                            <w:r>
-                              <w:t xml:space="preserve"> ID.</w:t>
+                              <w:t>FlexSpace</w:t>
+                            </w:r>
+                            <w:proofErr w:type="spellEnd"/>
+                            <w:r>
+                              <w:rPr>
+                                <w:b/>
+                              </w:rPr>
+                              <w:t xml:space="preserve"> – </w:t>
+                            </w:r>
+                            <w:r>
+                              <w:rPr>
+                                <w:bCs/>
+                              </w:rPr>
+                              <w:t>is a modern coworking space booking platform designed for Iloilo City (expandable nationwide). It connects users with available coworking spaces across different districts, allowing seamless browsing, booking, and management of workspaces.</w:t>
                             </w:r>
                           </w:p>
                           <w:p>
                             <w:pPr>
                               <w:spacing w:after="20"/>
                             </w:pPr>
-                            <w:r>
-                              <w:rPr>
-                                <w:b/>
-                              </w:rPr>
-                              <w:t>The Daily Grind</w:t>
-                            </w:r>
-                            <w:r>
-                              <w:rPr>
-                                <w:b/>
-                              </w:rPr>
-                              <w:t xml:space="preserve"> – </w:t>
-                            </w:r>
-                            <w:r>
-                              <w:t>Make an ecommerce that have a responsive website using PHP.</w:t>
-                            </w:r>
-                          </w:p>
-                          <w:p>
-                            <w:pPr>
-                              <w:spacing w:after="20"/>
-                            </w:pPr>
-                            <w:r>
-                              <w:rPr>
-                                <w:b/>
-                              </w:rPr>
-                              <w:t xml:space="preserve">Network Design – </w:t>
-                            </w:r>
-                            <w:r>
-                              <w:t>Created a basic network topology using Cisco Packet Tracer and configured basic IP addressing.</w:t>
-                            </w:r>
                           </w:p>
                           <w:p>
                             <w:pPr>
@@ -679,7 +682,7 @@
           </mc:Choice>
           <mc:Fallback>
             <w:pict>
-              <v:shape w14:anchorId="25BDAFA6" id="Text Box 27" o:spid="_x0000_s1028" type="#_x0000_t202" style="position:absolute;left:0;text-align:left;margin-left:12.5pt;margin-top:541pt;width:169.5pt;height:245pt;z-index:251707392;visibility:visible;mso-wrap-style:square;mso-width-percent:0;mso-height-percent:0;mso-wrap-distance-left:9pt;mso-wrap-distance-top:3.6pt;mso-wrap-distance-right:9pt;mso-wrap-distance-bottom:3.6pt;mso-position-horizontal:absolute;mso-position-horizontal-relative:page;mso-position-vertical:absolute;mso-position-vertical-relative:page;mso-width-percent:0;mso-height-percent:0;mso-width-relative:margin;mso-height-relative:margin;v-text-anchor:top" o:gfxdata="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" filled="f" stroked="f">
+              <v:shape w14:anchorId="183F9B02" id="Text Box 27" o:spid="_x0000_s1028" type="#_x0000_t202" style="position:absolute;left:0;text-align:left;margin-left:12.5pt;margin-top:526.5pt;width:169.5pt;height:324.9pt;z-index:251666432;visibility:visible;mso-wrap-style:square;mso-width-percent:0;mso-height-percent:0;mso-wrap-distance-left:9pt;mso-wrap-distance-top:3.6pt;mso-wrap-distance-right:9pt;mso-wrap-distance-bottom:3.6pt;mso-position-horizontal:absolute;mso-position-horizontal-relative:page;mso-position-vertical:absolute;mso-position-vertical-relative:page;mso-width-percent:0;mso-height-percent:0;mso-width-relative:margin;mso-height-relative:margin;v-text-anchor:top" o:gfxdata="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" filled="f" stroked="f">
                 <v:textbox>
                   <w:txbxContent>
                     <w:p>
@@ -695,27 +698,20 @@
                           <w:sz w:val="24"/>
                           <w:szCs w:val="24"/>
                         </w:rPr>
-                        <w:t>Ac</w:t>
+                        <w:t>AcADEMIC</w:t>
                       </w:r>
                       <w:r>
                         <w:rPr>
                           <w:sz w:val="24"/>
                           <w:szCs w:val="24"/>
                         </w:rPr>
-                        <w:t>ADEMIC</w:t>
+                        <w:t xml:space="preserve"> </w:t>
                       </w:r>
                       <w:r>
                         <w:rPr>
                           <w:sz w:val="24"/>
                           <w:szCs w:val="24"/>
                         </w:rPr>
-                        <w:t xml:space="preserve"> </w:t>
-                      </w:r>
-                      <w:r>
-                        <w:rPr>
-                          <w:sz w:val="24"/>
-                          <w:szCs w:val="24"/>
-                        </w:rPr>
                         <w:t>PROJECTS</w:t>
                       </w:r>
                     </w:p>
@@ -730,71 +726,55 @@
                         <w:rPr>
                           <w:b/>
                         </w:rPr>
-                        <w:t xml:space="preserve">ID Management System </w:t>
-                      </w:r>
+                        <w:t xml:space="preserve">ID Management System – </w:t>
+                      </w:r>
+                      <w:r>
+                        <w:t>Make an ID managing system where student can apply to get their ID.</w:t>
+                      </w:r>
+                    </w:p>
+                    <w:p>
+                      <w:pPr>
+                        <w:spacing w:after="20"/>
+                      </w:pPr>
                       <w:r>
                         <w:rPr>
                           <w:b/>
                         </w:rPr>
-                        <w:t>–</w:t>
-                      </w:r>
+                        <w:t xml:space="preserve">The Daily Grind – </w:t>
+                      </w:r>
+                      <w:r>
+                        <w:t>Make an ecommerce that have a responsive website using PHP.</w:t>
+                      </w:r>
+                    </w:p>
+                    <w:p>
+                      <w:pPr>
+                        <w:spacing w:after="20"/>
+                      </w:pPr>
+                      <w:proofErr w:type="spellStart"/>
                       <w:r>
                         <w:rPr>
                           <w:b/>
                         </w:rPr>
-                        <w:t xml:space="preserve"> </w:t>
-                      </w:r>
-                      <w:r>
-                        <w:t xml:space="preserve">Make </w:t>
-                      </w:r>
-                      <w:proofErr w:type="gramStart"/>
-                      <w:r>
-                        <w:t>a</w:t>
-                      </w:r>
-                      <w:proofErr w:type="gramEnd"/>
-                      <w:r>
-                        <w:t xml:space="preserve"> ID managing system where student can apply to get </w:t>
-                      </w:r>
-                      <w:r>
-                        <w:t>their</w:t>
-                      </w:r>
-                      <w:r>
-                        <w:t xml:space="preserve"> ID.</w:t>
+                        <w:t>FlexSpace</w:t>
+                      </w:r>
+                      <w:proofErr w:type="spellEnd"/>
+                      <w:r>
+                        <w:rPr>
+                          <w:b/>
+                        </w:rPr>
+                        <w:t xml:space="preserve"> – </w:t>
+                      </w:r>
+                      <w:r>
+                        <w:rPr>
+                          <w:bCs/>
+                        </w:rPr>
+                        <w:t>is a modern coworking space booking platform designed for Iloilo City (expandable nationwide). It connects users with available coworking spaces across different districts, allowing seamless browsing, booking, and management of workspaces.</w:t>
                       </w:r>
                     </w:p>
                     <w:p>
                       <w:pPr>
                         <w:spacing w:after="20"/>
                       </w:pPr>
-                      <w:r>
-                        <w:rPr>
-                          <w:b/>
-                        </w:rPr>
-                        <w:t>The Daily Grind</w:t>
-                      </w:r>
-                      <w:r>
-                        <w:rPr>
-                          <w:b/>
-                        </w:rPr>
-                        <w:t xml:space="preserve"> – </w:t>
-                      </w:r>
-                      <w:r>
-                        <w:t>Make an ecommerce that have a responsive website using PHP.</w:t>
-                      </w:r>
-                    </w:p>
-                    <w:p>
-                      <w:pPr>
-                        <w:spacing w:after="20"/>
-                      </w:pPr>
-                      <w:r>
-                        <w:rPr>
-                          <w:b/>
-                        </w:rPr>
-                        <w:t xml:space="preserve">Network Design – </w:t>
-                      </w:r>
-                      <w:r>
-                        <w:t>Created a basic network topology using Cisco Packet Tracer and configured basic IP addressing.</w:t>
-                      </w:r>
                     </w:p>
                     <w:p>
                       <w:pPr>
@@ -803,7 +783,7 @@
                     </w:p>
                   </w:txbxContent>
                 </v:textbox>
-                <w10:wrap type="square" anchorx="page" anchory="page"/>
+                <w10:wrap anchorx="page" anchory="page"/>
                 <w10:anchorlock/>
               </v:shape>
             </w:pict>
@@ -818,13 +798,13 @@
         <mc:AlternateContent>
           <mc:Choice Requires="wps">
             <w:drawing>
-              <wp:anchor distT="45720" distB="45720" distL="114300" distR="114300" simplePos="0" relativeHeight="251708416" behindDoc="0" locked="1" layoutInCell="1" allowOverlap="1" wp14:anchorId="4D1FE626" wp14:editId="30B70674">
+              <wp:anchor distT="45720" distB="45720" distL="114300" distR="114300" simplePos="0" relativeHeight="251667456" behindDoc="0" locked="1" layoutInCell="1" allowOverlap="1" wp14:anchorId="04242D6D" wp14:editId="7AEF53D5">
                 <wp:simplePos x="0" y="0"/>
                 <wp:positionH relativeFrom="page">
-                  <wp:posOffset>2711450</wp:posOffset>
+                  <wp:posOffset>2655570</wp:posOffset>
                 </wp:positionH>
                 <wp:positionV relativeFrom="page">
-                  <wp:posOffset>1925320</wp:posOffset>
+                  <wp:posOffset>1942465</wp:posOffset>
                 </wp:positionV>
                 <wp:extent cx="4608195" cy="1819275"/>
                 <wp:effectExtent l="0" t="0" r="0" b="0"/>
@@ -866,19 +846,13 @@
                             </w:r>
                           </w:p>
                           <w:p>
-                            <w:pPr>
+                            <w:r>
                               <w:rPr>
                                 <w:szCs w:val="22"/>
                               </w:rPr>
-                            </w:pPr>
-                            <w:r>
-                              <w:rPr>
-                                <w:szCs w:val="22"/>
-                              </w:rPr>
-                              <w:t>A motivated BS Information Technology student seeking an On-the-Job Training opportunity to apply classroom knowledge, develop technical and professional skills, gain actual industry experience, and contribute positively to the organization.</w:t>
-                            </w:r>
-                          </w:p>
-                          <w:p/>
+                              <w:t>BS Information Technology student eager to secure an On-the-Job Training position to apply technical expertise, collaborate on development initiatives, and gain hands-on operational experience.</w:t>
+                            </w:r>
+                          </w:p>
                         </w:txbxContent>
                       </wps:txbx>
                       <wps:bodyPr rot="0" vert="horz" wrap="square" lIns="91440" tIns="45720" rIns="91440" bIns="45720" anchor="t" anchorCtr="0">
@@ -898,7 +872,7 @@
           </mc:Choice>
           <mc:Fallback>
             <w:pict>
-              <v:shape w14:anchorId="4D1FE626" id="Text Box 26" o:spid="_x0000_s1029" type="#_x0000_t202" style="position:absolute;left:0;text-align:left;margin-left:213.5pt;margin-top:151.6pt;width:362.85pt;height:143.25pt;z-index:251708416;visibility:visible;mso-wrap-style:square;mso-width-percent:0;mso-height-percent:0;mso-wrap-distance-left:9pt;mso-wrap-distance-top:3.6pt;mso-wrap-distance-right:9pt;mso-wrap-distance-bottom:3.6pt;mso-position-horizontal:absolute;mso-position-horizontal-relative:page;mso-position-vertical:absolute;mso-position-vertical-relative:page;mso-width-percent:0;mso-height-percent:0;mso-width-relative:margin;mso-height-relative:margin;v-text-anchor:top" o:gfxdata="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" filled="f" stroked="f">
+              <v:shape w14:anchorId="04242D6D" id="Text Box 26" o:spid="_x0000_s1029" type="#_x0000_t202" style="position:absolute;left:0;text-align:left;margin-left:209.1pt;margin-top:152.95pt;width:362.85pt;height:143.25pt;z-index:251667456;visibility:visible;mso-wrap-style:square;mso-width-percent:0;mso-height-percent:0;mso-wrap-distance-left:9pt;mso-wrap-distance-top:3.6pt;mso-wrap-distance-right:9pt;mso-wrap-distance-bottom:3.6pt;mso-position-horizontal:absolute;mso-position-horizontal-relative:page;mso-position-vertical:absolute;mso-position-vertical-relative:page;mso-width-percent:0;mso-height-percent:0;mso-width-relative:margin;mso-height-relative:margin;v-text-anchor:top" o:gfxdata="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" filled="f" stroked="f">
                 <v:textbox>
                   <w:txbxContent>
                     <w:p>
@@ -910,19 +884,13 @@
                       </w:r>
                     </w:p>
                     <w:p>
-                      <w:pPr>
+                      <w:r>
                         <w:rPr>
                           <w:szCs w:val="22"/>
                         </w:rPr>
-                      </w:pPr>
-                      <w:r>
-                        <w:rPr>
-                          <w:szCs w:val="22"/>
-                        </w:rPr>
-                        <w:t>A motivated BS Information Technology student seeking an On-the-Job Training opportunity to apply classroom knowledge, develop technical and professional skills, gain actual industry experience, and contribute positively to the organization.</w:t>
-                      </w:r>
-                    </w:p>
-                    <w:p/>
+                        <w:t>BS Information Technology student eager to secure an On-the-Job Training position to apply technical expertise, collaborate on development initiatives, and gain hands-on operational experience.</w:t>
+                      </w:r>
+                    </w:p>
                   </w:txbxContent>
                 </v:textbox>
                 <w10:wrap type="square" anchorx="page" anchory="page"/>
@@ -940,13 +908,13 @@
         <mc:AlternateContent>
           <mc:Choice Requires="wps">
             <w:drawing>
-              <wp:anchor distT="45720" distB="45720" distL="114300" distR="114300" simplePos="0" relativeHeight="251709440" behindDoc="0" locked="1" layoutInCell="1" allowOverlap="1" wp14:anchorId="68298BEB" wp14:editId="27352DC1">
+              <wp:anchor distT="45720" distB="45720" distL="114300" distR="114300" simplePos="0" relativeHeight="251668480" behindDoc="0" locked="1" layoutInCell="1" allowOverlap="1" wp14:anchorId="4A701D25" wp14:editId="4A1AFD91">
                 <wp:simplePos x="0" y="0"/>
                 <wp:positionH relativeFrom="margin">
-                  <wp:posOffset>2260600</wp:posOffset>
+                  <wp:posOffset>2188845</wp:posOffset>
                 </wp:positionH>
                 <wp:positionV relativeFrom="page">
-                  <wp:posOffset>3194050</wp:posOffset>
+                  <wp:posOffset>2947035</wp:posOffset>
                 </wp:positionV>
                 <wp:extent cx="4819650" cy="6832600"/>
                 <wp:effectExtent l="0" t="0" r="0" b="6350"/>
@@ -1022,7 +990,7 @@
                               <w:t xml:space="preserve">Technical: </w:t>
                             </w:r>
                             <w:r>
-                              <w:t>HTML/CSS, basic JavaScript, basic PHP, basic Python, MySQL, basic networking, troubleshooting, data entry and data management</w:t>
+                              <w:t>HTML/CSS, basic JavaScript, basic PHP, basic Python, MySQL, basic networking, troubleshooting, basic data entry and data management.</w:t>
                             </w:r>
                           </w:p>
                           <w:p>
@@ -1036,7 +1004,7 @@
                               <w:t xml:space="preserve">Tools: </w:t>
                             </w:r>
                             <w:r>
-                              <w:t>Microsoft Word, Excel, PowerPoint, Google Workspace, Canva, Visual Studio Code, GitHub, basic Figma</w:t>
+                              <w:t>Microsoft Word, Excel, PowerPoint, Google Workspace, Canva, Visual Studio Code, GitHub, basic Figma.</w:t>
                             </w:r>
                           </w:p>
                           <w:p>
@@ -1050,7 +1018,7 @@
                               <w:t xml:space="preserve">Professional: </w:t>
                             </w:r>
                             <w:r>
-                              <w:t>Communication, teamwork, problem-solving, time management, adaptability, willingness to learn, attention to detail</w:t>
+                              <w:t>Communication, teamwork, problem-solving, time management, adaptability, willingness to learn, attention to detail.</w:t>
                             </w:r>
                           </w:p>
                           <w:p>
@@ -1125,10 +1093,7 @@
                               <w:t xml:space="preserve">• </w:t>
                             </w:r>
                             <w:r>
-                              <w:t>Microsoft Excel Fundamentals – 202</w:t>
-                            </w:r>
-                            <w:r>
-                              <w:t>6</w:t>
+                              <w:t>Microsoft Excel Fundamentals – 2026</w:t>
                             </w:r>
                           </w:p>
                           <w:p>
@@ -1179,77 +1144,36 @@
                               </w:rPr>
                               <w:t xml:space="preserve"> </w:t>
                             </w:r>
+                          </w:p>
+                          <w:p>
+                            <w:pPr>
+                              <w:spacing w:after="20"/>
+                            </w:pPr>
                             <w:r>
                               <w:rPr>
                                 <w:b/>
-                                <w:color w:val="7F6146" w:themeColor="accent2"/>
-                                <w:sz w:val="16"/>
-                                <w:szCs w:val="16"/>
-                              </w:rPr>
-                              <w:t>(</w:t>
-                            </w:r>
-                            <w:r>
-                              <w:rPr>
-                                <w:b/>
-                                <w:bCs/>
-                                <w:i/>
-                                <w:iCs/>
-                                <w:sz w:val="16"/>
-                                <w:szCs w:val="16"/>
-                              </w:rPr>
-                              <w:t xml:space="preserve">if orgs/activities/competition related to </w:t>
-                            </w:r>
-                            <w:proofErr w:type="gramStart"/>
-                            <w:r>
-                              <w:rPr>
-                                <w:b/>
-                                <w:bCs/>
-                                <w:i/>
-                                <w:iCs/>
-                                <w:sz w:val="16"/>
-                                <w:szCs w:val="16"/>
-                              </w:rPr>
-                              <w:t>IT ,</w:t>
-                            </w:r>
-                            <w:proofErr w:type="gramEnd"/>
-                            <w:r>
-                              <w:rPr>
-                                <w:b/>
-                                <w:bCs/>
-                                <w:i/>
-                                <w:iCs/>
-                                <w:sz w:val="16"/>
-                                <w:szCs w:val="16"/>
-                              </w:rPr>
-                              <w:t xml:space="preserve"> just removed this section)</w:t>
-                            </w:r>
-                          </w:p>
-                          <w:p>
-                            <w:pPr>
-                              <w:spacing w:after="20"/>
-                            </w:pPr>
-                            <w:r>
-                              <w:rPr>
-                                <w:b/>
-                              </w:rPr>
-                              <w:t>Member –</w:t>
-                            </w:r>
-                            <w:r>
-                              <w:rPr>
-                                <w:b/>
-                              </w:rPr>
-                              <w:t xml:space="preserve"> UI Programing Circle</w:t>
-                            </w:r>
-                            <w:r>
-                              <w:rPr>
-                                <w:b/>
-                              </w:rPr>
-                              <w:t xml:space="preserve"> | 2024–Present</w:t>
+                              </w:rPr>
+                              <w:t>Member – UI Programing Circle | 2024–Present</w:t>
                             </w:r>
                             <w:r>
                               <w:br/>
                               <w:t>Participated in IT-related activities, seminars, departmental events, and team-based projects.</w:t>
                             </w:r>
+                          </w:p>
+                          <w:p>
+                            <w:pPr>
+                              <w:spacing w:after="20"/>
+                            </w:pPr>
+                          </w:p>
+                          <w:p>
+                            <w:pPr>
+                              <w:spacing w:after="20"/>
+                            </w:pPr>
+                          </w:p>
+                          <w:p>
+                            <w:pPr>
+                              <w:spacing w:after="20"/>
+                            </w:pPr>
                           </w:p>
                           <w:p>
                             <w:pPr>
@@ -1281,88 +1205,7 @@
                                 <w:sz w:val="28"/>
                                 <w:szCs w:val="28"/>
                               </w:rPr>
-                              <w:t xml:space="preserve"> (</w:t>
-                            </w:r>
-                            <w:r>
-                              <w:rPr>
-                                <w:b/>
-                                <w:bCs/>
-                                <w:i/>
-                                <w:iCs/>
-                                <w:sz w:val="16"/>
-                                <w:szCs w:val="16"/>
-                              </w:rPr>
-                              <w:t xml:space="preserve">provide </w:t>
-                            </w:r>
-                            <w:proofErr w:type="spellStart"/>
-                            <w:r>
-                              <w:rPr>
-                                <w:b/>
-                                <w:bCs/>
-                                <w:i/>
-                                <w:iCs/>
-                                <w:sz w:val="16"/>
-                                <w:szCs w:val="16"/>
-                              </w:rPr>
-                              <w:t>aleast</w:t>
-                            </w:r>
-                            <w:proofErr w:type="spellEnd"/>
-                            <w:r>
-                              <w:rPr>
-                                <w:b/>
-                                <w:bCs/>
-                                <w:i/>
-                                <w:iCs/>
-                                <w:sz w:val="16"/>
-                                <w:szCs w:val="16"/>
-                              </w:rPr>
-                              <w:t xml:space="preserve"> 2/3 </w:t>
-                            </w:r>
-                            <w:r>
-                              <w:rPr>
-                                <w:b/>
-                                <w:bCs/>
-                                <w:i/>
-                                <w:iCs/>
-                                <w:sz w:val="16"/>
-                                <w:szCs w:val="16"/>
-                              </w:rPr>
-                              <w:t>references</w:t>
-                            </w:r>
-                            <w:r>
-                              <w:rPr>
-                                <w:b/>
-                                <w:bCs/>
-                                <w:i/>
-                                <w:iCs/>
-                                <w:sz w:val="16"/>
-                                <w:szCs w:val="16"/>
-                              </w:rPr>
-                              <w:t xml:space="preserve"> not parents it must </w:t>
-                            </w:r>
-                            <w:proofErr w:type="gramStart"/>
-                            <w:r>
-                              <w:rPr>
-                                <w:b/>
-                                <w:bCs/>
-                                <w:i/>
-                                <w:iCs/>
-                                <w:sz w:val="16"/>
-                                <w:szCs w:val="16"/>
-                              </w:rPr>
-                              <w:t>professional,teacher</w:t>
-                            </w:r>
-                            <w:proofErr w:type="gramEnd"/>
-                            <w:r>
-                              <w:rPr>
-                                <w:b/>
-                                <w:bCs/>
-                                <w:i/>
-                                <w:iCs/>
-                                <w:sz w:val="16"/>
-                                <w:szCs w:val="16"/>
-                              </w:rPr>
-                              <w:t>,dean)</w:t>
+                              <w:t xml:space="preserve"> </w:t>
                             </w:r>
                           </w:p>
                         </w:txbxContent>
@@ -1384,7 +1227,7 @@
           </mc:Choice>
           <mc:Fallback>
             <w:pict>
-              <v:shape w14:anchorId="68298BEB" id="Text Box 13" o:spid="_x0000_s1030" type="#_x0000_t202" style="position:absolute;left:0;text-align:left;margin-left:178pt;margin-top:251.5pt;width:379.5pt;height:538pt;z-index:251709440;visibility:visible;mso-wrap-style:square;mso-width-percent:0;mso-height-percent:0;mso-wrap-distance-left:9pt;mso-wrap-distance-top:3.6pt;mso-wrap-distance-right:9pt;mso-wrap-distance-bottom:3.6pt;mso-position-horizontal:absolute;mso-position-horizontal-relative:margin;mso-position-vertical:absolute;mso-position-vertical-relative:page;mso-width-percent:0;mso-height-percent:0;mso-width-relative:margin;mso-height-relative:margin;v-text-anchor:top" o:gfxdata="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" filled="f" stroked="f">
+              <v:shape w14:anchorId="4A701D25" id="Text Box 13" o:spid="_x0000_s1030" type="#_x0000_t202" style="position:absolute;left:0;text-align:left;margin-left:172.35pt;margin-top:232.05pt;width:379.5pt;height:538pt;z-index:251668480;visibility:visible;mso-wrap-style:square;mso-width-percent:0;mso-height-percent:0;mso-wrap-distance-left:9pt;mso-wrap-distance-top:3.6pt;mso-wrap-distance-right:9pt;mso-wrap-distance-bottom:3.6pt;mso-position-horizontal:absolute;mso-position-horizontal-relative:margin;mso-position-vertical:absolute;mso-position-vertical-relative:page;mso-width-percent:0;mso-height-percent:0;mso-width-relative:margin;mso-height-relative:margin;v-text-anchor:top" o:gfxdata="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" filled="f" stroked="f">
                 <v:textbox>
                   <w:txbxContent>
                     <w:p>
@@ -1430,7 +1273,7 @@
                         <w:t xml:space="preserve">Technical: </w:t>
                       </w:r>
                       <w:r>
-                        <w:t>HTML/CSS, basic JavaScript, basic PHP, basic Python, MySQL, basic networking, troubleshooting, data entry and data management</w:t>
+                        <w:t>HTML/CSS, basic JavaScript, basic PHP, basic Python, MySQL, basic networking, troubleshooting, basic data entry and data management.</w:t>
                       </w:r>
                     </w:p>
                     <w:p>
@@ -1444,7 +1287,7 @@
                         <w:t xml:space="preserve">Tools: </w:t>
                       </w:r>
                       <w:r>
-                        <w:t>Microsoft Word, Excel, PowerPoint, Google Workspace, Canva, Visual Studio Code, GitHub, basic Figma</w:t>
+                        <w:t>Microsoft Word, Excel, PowerPoint, Google Workspace, Canva, Visual Studio Code, GitHub, basic Figma.</w:t>
                       </w:r>
                     </w:p>
                     <w:p>
@@ -1458,7 +1301,7 @@
                         <w:t xml:space="preserve">Professional: </w:t>
                       </w:r>
                       <w:r>
-                        <w:t>Communication, teamwork, problem-solving, time management, adaptability, willingness to learn, attention to detail</w:t>
+                        <w:t>Communication, teamwork, problem-solving, time management, adaptability, willingness to learn, attention to detail.</w:t>
                       </w:r>
                     </w:p>
                     <w:p>
@@ -1533,10 +1376,7 @@
                         <w:t xml:space="preserve">• </w:t>
                       </w:r>
                       <w:r>
-                        <w:t>Microsoft Excel Fundamentals – 202</w:t>
-                      </w:r>
-                      <w:r>
-                        <w:t>6</w:t>
+                        <w:t>Microsoft Excel Fundamentals – 2026</w:t>
                       </w:r>
                     </w:p>
                     <w:p>
@@ -1587,77 +1427,36 @@
                         </w:rPr>
                         <w:t xml:space="preserve"> </w:t>
                       </w:r>
+                    </w:p>
+                    <w:p>
+                      <w:pPr>
+                        <w:spacing w:after="20"/>
+                      </w:pPr>
                       <w:r>
                         <w:rPr>
                           <w:b/>
-                          <w:color w:val="7F6146" w:themeColor="accent2"/>
-                          <w:sz w:val="16"/>
-                          <w:szCs w:val="16"/>
-                        </w:rPr>
-                        <w:t>(</w:t>
-                      </w:r>
-                      <w:r>
-                        <w:rPr>
-                          <w:b/>
-                          <w:bCs/>
-                          <w:i/>
-                          <w:iCs/>
-                          <w:sz w:val="16"/>
-                          <w:szCs w:val="16"/>
-                        </w:rPr>
-                        <w:t xml:space="preserve">if orgs/activities/competition related to </w:t>
-                      </w:r>
-                      <w:proofErr w:type="gramStart"/>
-                      <w:r>
-                        <w:rPr>
-                          <w:b/>
-                          <w:bCs/>
-                          <w:i/>
-                          <w:iCs/>
-                          <w:sz w:val="16"/>
-                          <w:szCs w:val="16"/>
-                        </w:rPr>
-                        <w:t>IT ,</w:t>
-                      </w:r>
-                      <w:proofErr w:type="gramEnd"/>
-                      <w:r>
-                        <w:rPr>
-                          <w:b/>
-                          <w:bCs/>
-                          <w:i/>
-                          <w:iCs/>
-                          <w:sz w:val="16"/>
-                          <w:szCs w:val="16"/>
-                        </w:rPr>
-                        <w:t xml:space="preserve"> just removed this section)</w:t>
-                      </w:r>
-                    </w:p>
-                    <w:p>
-                      <w:pPr>
-                        <w:spacing w:after="20"/>
-                      </w:pPr>
-                      <w:r>
-                        <w:rPr>
-                          <w:b/>
-                        </w:rPr>
-                        <w:t>Member –</w:t>
-                      </w:r>
-                      <w:r>
-                        <w:rPr>
-                          <w:b/>
-                        </w:rPr>
-                        <w:t xml:space="preserve"> UI Programing Circle</w:t>
-                      </w:r>
-                      <w:r>
-                        <w:rPr>
-                          <w:b/>
-                        </w:rPr>
-                        <w:t xml:space="preserve"> | 2024–Present</w:t>
+                        </w:rPr>
+                        <w:t>Member – UI Programing Circle | 2024–Present</w:t>
                       </w:r>
                       <w:r>
                         <w:br/>
                         <w:t>Participated in IT-related activities, seminars, departmental events, and team-based projects.</w:t>
                       </w:r>
+                    </w:p>
+                    <w:p>
+                      <w:pPr>
+                        <w:spacing w:after="20"/>
+                      </w:pPr>
+                    </w:p>
+                    <w:p>
+                      <w:pPr>
+                        <w:spacing w:after="20"/>
+                      </w:pPr>
+                    </w:p>
+                    <w:p>
+                      <w:pPr>
+                        <w:spacing w:after="20"/>
+                      </w:pPr>
                     </w:p>
                     <w:p>
                       <w:pPr>
@@ -1689,88 +1488,7 @@
                           <w:sz w:val="28"/>
                           <w:szCs w:val="28"/>
                         </w:rPr>
-                        <w:t xml:space="preserve"> (</w:t>
-                      </w:r>
-                      <w:r>
-                        <w:rPr>
-                          <w:b/>
-                          <w:bCs/>
-                          <w:i/>
-                          <w:iCs/>
-                          <w:sz w:val="16"/>
-                          <w:szCs w:val="16"/>
-                        </w:rPr>
-                        <w:t xml:space="preserve">provide </w:t>
-                      </w:r>
-                      <w:proofErr w:type="spellStart"/>
-                      <w:r>
-                        <w:rPr>
-                          <w:b/>
-                          <w:bCs/>
-                          <w:i/>
-                          <w:iCs/>
-                          <w:sz w:val="16"/>
-                          <w:szCs w:val="16"/>
-                        </w:rPr>
-                        <w:t>aleast</w:t>
-                      </w:r>
-                      <w:proofErr w:type="spellEnd"/>
-                      <w:r>
-                        <w:rPr>
-                          <w:b/>
-                          <w:bCs/>
-                          <w:i/>
-                          <w:iCs/>
-                          <w:sz w:val="16"/>
-                          <w:szCs w:val="16"/>
-                        </w:rPr>
-                        <w:t xml:space="preserve"> 2/3 </w:t>
-                      </w:r>
-                      <w:r>
-                        <w:rPr>
-                          <w:b/>
-                          <w:bCs/>
-                          <w:i/>
-                          <w:iCs/>
-                          <w:sz w:val="16"/>
-                          <w:szCs w:val="16"/>
-                        </w:rPr>
-                        <w:t>references</w:t>
-                      </w:r>
-                      <w:r>
-                        <w:rPr>
-                          <w:b/>
-                          <w:bCs/>
-                          <w:i/>
-                          <w:iCs/>
-                          <w:sz w:val="16"/>
-                          <w:szCs w:val="16"/>
-                        </w:rPr>
-                        <w:t xml:space="preserve"> not parents it must </w:t>
-                      </w:r>
-                      <w:proofErr w:type="gramStart"/>
-                      <w:r>
-                        <w:rPr>
-                          <w:b/>
-                          <w:bCs/>
-                          <w:i/>
-                          <w:iCs/>
-                          <w:sz w:val="16"/>
-                          <w:szCs w:val="16"/>
-                        </w:rPr>
-                        <w:t>professional,teacher</w:t>
-                      </w:r>
-                      <w:proofErr w:type="gramEnd"/>
-                      <w:r>
-                        <w:rPr>
-                          <w:b/>
-                          <w:bCs/>
-                          <w:i/>
-                          <w:iCs/>
-                          <w:sz w:val="16"/>
-                          <w:szCs w:val="16"/>
-                        </w:rPr>
-                        <w:t>,dean)</w:t>
+                        <w:t xml:space="preserve"> </w:t>
                       </w:r>
                     </w:p>
                   </w:txbxContent>
@@ -1790,7 +1508,7 @@
         <mc:AlternateContent>
           <mc:Choice Requires="wps">
             <w:drawing>
-              <wp:anchor distT="45720" distB="45720" distL="114300" distR="114300" simplePos="0" relativeHeight="251695104" behindDoc="0" locked="1" layoutInCell="1" allowOverlap="1" wp14:anchorId="0E20526A" wp14:editId="18525CB7">
+              <wp:anchor distT="45720" distB="45720" distL="114300" distR="114300" simplePos="0" relativeHeight="251660288" behindDoc="0" locked="1" layoutInCell="1" allowOverlap="1" wp14:anchorId="087E7773" wp14:editId="76B92D19">
                 <wp:simplePos x="0" y="0"/>
                 <wp:positionH relativeFrom="page">
                   <wp:posOffset>320040</wp:posOffset>
@@ -1856,7 +1574,7 @@
           </mc:Choice>
           <mc:Fallback>
             <w:pict>
-              <v:shape w14:anchorId="0E20526A" id="Text Box 25" o:spid="_x0000_s1031" type="#_x0000_t202" style="position:absolute;left:0;text-align:left;margin-left:25.2pt;margin-top:168pt;width:144.7pt;height:22.3pt;z-index:251695104;visibility:visible;mso-wrap-style:square;mso-width-percent:0;mso-height-percent:0;mso-wrap-distance-left:9pt;mso-wrap-distance-top:3.6pt;mso-wrap-distance-right:9pt;mso-wrap-distance-bottom:3.6pt;mso-position-horizontal:absolute;mso-position-horizontal-relative:page;mso-position-vertical:absolute;mso-position-vertical-relative:page;mso-width-percent:0;mso-height-percent:0;mso-width-relative:margin;mso-height-relative:margin;v-text-anchor:top" o:gfxdata="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" filled="f" stroked="f">
+              <v:shape w14:anchorId="087E7773" id="Text Box 25" o:spid="_x0000_s1031" type="#_x0000_t202" style="position:absolute;left:0;text-align:left;margin-left:25.2pt;margin-top:168pt;width:144.7pt;height:22.3pt;z-index:251660288;visibility:visible;mso-wrap-style:square;mso-width-percent:0;mso-height-percent:0;mso-wrap-distance-left:9pt;mso-wrap-distance-top:3.6pt;mso-wrap-distance-right:9pt;mso-wrap-distance-bottom:3.6pt;mso-position-horizontal:absolute;mso-position-horizontal-relative:page;mso-position-vertical:absolute;mso-position-vertical-relative:page;mso-width-percent:0;mso-height-percent:0;mso-width-relative:margin;mso-height-relative:margin;v-text-anchor:top" o:gfxdata="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" filled="f" stroked="f">
                 <v:textbox>
                   <w:txbxContent>
                     <w:p>
@@ -1883,16 +1601,16 @@
         <mc:AlternateContent>
           <mc:Choice Requires="wpg">
             <w:drawing>
-              <wp:anchor distT="0" distB="0" distL="114300" distR="114300" simplePos="0" relativeHeight="251688960" behindDoc="1" locked="1" layoutInCell="1" allowOverlap="1" wp14:anchorId="53E537E9" wp14:editId="03E70AA5">
+              <wp:anchor distT="0" distB="0" distL="114300" distR="114300" simplePos="0" relativeHeight="251659264" behindDoc="1" locked="1" layoutInCell="1" allowOverlap="1" wp14:anchorId="39040C5F" wp14:editId="6B5B6EC0">
                 <wp:simplePos x="0" y="0"/>
                 <wp:positionH relativeFrom="column">
-                  <wp:posOffset>-457200</wp:posOffset>
+                  <wp:posOffset>-488950</wp:posOffset>
                 </wp:positionH>
                 <wp:positionV relativeFrom="paragraph">
-                  <wp:posOffset>-228600</wp:posOffset>
+                  <wp:posOffset>-244475</wp:posOffset>
                 </wp:positionV>
-                <wp:extent cx="7772894" cy="10058400"/>
-                <wp:effectExtent l="0" t="0" r="0" b="0"/>
+                <wp:extent cx="7804150" cy="10686415"/>
+                <wp:effectExtent l="0" t="0" r="6350" b="635"/>
                 <wp:wrapNone/>
                 <wp:docPr id="747120365" name="Group 8">
                   <a:extLst xmlns:a="http://schemas.openxmlformats.org/drawingml/2006/main">
@@ -1909,9 +1627,9 @@
                       <wpg:grpSpPr>
                         <a:xfrm>
                           <a:off x="0" y="0"/>
-                          <a:ext cx="7772894" cy="10058400"/>
-                          <a:chOff x="0" y="0"/>
-                          <a:chExt cx="7772894" cy="10058400"/>
+                          <a:ext cx="7804150" cy="10686415"/>
+                          <a:chOff x="-32217" y="-12223"/>
+                          <a:chExt cx="7805111" cy="10686553"/>
                         </a:xfrm>
                       </wpg:grpSpPr>
                       <wps:wsp>
@@ -1960,8 +1678,8 @@
                         <wps:cNvSpPr/>
                         <wps:spPr>
                           <a:xfrm>
-                            <a:off x="0" y="0"/>
-                            <a:ext cx="2449195" cy="10058400"/>
+                            <a:off x="-32217" y="-12223"/>
+                            <a:ext cx="2449195" cy="10686553"/>
                           </a:xfrm>
                           <a:prstGeom prst="rect">
                             <a:avLst/>
@@ -2002,14 +1720,17 @@
                 <wp14:sizeRelH relativeFrom="margin">
                   <wp14:pctWidth>0</wp14:pctWidth>
                 </wp14:sizeRelH>
+                <wp14:sizeRelV relativeFrom="margin">
+                  <wp14:pctHeight>0</wp14:pctHeight>
+                </wp14:sizeRelV>
               </wp:anchor>
             </w:drawing>
           </mc:Choice>
           <mc:Fallback>
             <w:pict>
-              <v:group w14:anchorId="3289D1A5" id="Group 8" o:spid="_x0000_s1026" alt="&quot;&quot;" style="position:absolute;margin-left:-36pt;margin-top:-18pt;width:612.05pt;height:11in;z-index:-251627520;mso-width-relative:margin" coordsize="77728,100584" o:gfxdata="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">
+              <v:group w14:anchorId="7E08D852" id="Group 8" o:spid="_x0000_s1026" alt="&quot;&quot;" style="position:absolute;margin-left:-38.5pt;margin-top:-19.25pt;width:614.5pt;height:841.45pt;z-index:-251657216;mso-width-relative:margin;mso-height-relative:margin" coordorigin="-322,-122" coordsize="78051,106865" o:gfxdata="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">
                 <v:rect id="Rectangle 802873958" o:spid="_x0000_s1027" style="position:absolute;left:23425;top:18592;width:54303;height:697;visibility:visible;mso-wrap-style:square;v-text-anchor:middle" o:gfxdata="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" fillcolor="#f2efea" stroked="f" strokeweight="1pt"/>
-                <v:rect id="Rectangle 351103453" o:spid="_x0000_s1028" style="position:absolute;width:24491;height:100584;visibility:visible;mso-wrap-style:square;v-text-anchor:middle" o:gfxdata="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" fillcolor="#f2efea" stroked="f" strokeweight="1pt"/>
+                <v:rect id="Rectangle 351103453" o:spid="_x0000_s1028" style="position:absolute;left:-322;top:-122;width:24491;height:106865;visibility:visible;mso-wrap-style:square;v-text-anchor:middle" o:gfxdata="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" fillcolor="#f2efea" stroked="f" strokeweight="1pt"/>
                 <w10:anchorlock/>
               </v:group>
             </w:pict>
@@ -2022,7 +1743,7 @@
         <w:pStyle w:val="Title2"/>
       </w:pPr>
       <w:r>
-        <w:t>Jo vincent Beldad</w:t>
+        <w:t>Jo vincent b. Beldad</w:t>
       </w:r>
     </w:p>
     <w:p>
@@ -2039,18 +1760,18 @@
         <mc:AlternateContent>
           <mc:Choice Requires="wps">
             <w:drawing>
-              <wp:anchor distT="0" distB="0" distL="114300" distR="114300" simplePos="0" relativeHeight="251721728" behindDoc="0" locked="0" layoutInCell="1" allowOverlap="1" wp14:anchorId="4E93E718" wp14:editId="5FA189A4">
+              <wp:anchor distT="0" distB="0" distL="114300" distR="114300" simplePos="0" relativeHeight="251674624" behindDoc="0" locked="0" layoutInCell="1" allowOverlap="1" wp14:anchorId="2DB4BE94" wp14:editId="09FFECF1">
                 <wp:simplePos x="0" y="0"/>
                 <wp:positionH relativeFrom="column">
-                  <wp:posOffset>128588</wp:posOffset>
+                  <wp:posOffset>183202</wp:posOffset>
                 </wp:positionH>
                 <wp:positionV relativeFrom="paragraph">
-                  <wp:posOffset>2663190</wp:posOffset>
+                  <wp:posOffset>1787364</wp:posOffset>
                 </wp:positionV>
-                <wp:extent cx="1838325" cy="271463"/>
-                <wp:effectExtent l="0" t="0" r="0" b="0"/>
+                <wp:extent cx="1604645" cy="409575"/>
+                <wp:effectExtent l="0" t="0" r="0" b="9525"/>
                 <wp:wrapNone/>
-                <wp:docPr id="1733427467" name="Text Box 13"/>
+                <wp:docPr id="780567725" name="Text Box 12"/>
                 <wp:cNvGraphicFramePr/>
                 <a:graphic xmlns:a="http://schemas.openxmlformats.org/drawingml/2006/main">
                   <a:graphicData uri="http://schemas.microsoft.com/office/word/2010/wordprocessingShape">
@@ -2059,7 +1780,7 @@
                       <wps:spPr>
                         <a:xfrm>
                           <a:off x="0" y="0"/>
-                          <a:ext cx="1838325" cy="271463"/>
+                          <a:ext cx="1604645" cy="409575"/>
                         </a:xfrm>
                         <a:prstGeom prst="rect">
                           <a:avLst/>
@@ -2088,15 +1809,63 @@
                           <w:p>
                             <w:pPr>
                               <w:pStyle w:val="ContactInfo"/>
-                            </w:pPr>
-                            <w:r>
+                              <w:spacing w:line="30" w:lineRule="atLeast"/>
+                              <w:jc w:val="left"/>
                               <w:rPr>
                                 <w:sz w:val="17"/>
                               </w:rPr>
-                              <w:t>https://github.com/Shu0405-Ghost</w:t>
-                            </w:r>
-                          </w:p>
-                          <w:p/>
+                            </w:pPr>
+                            <w:r>
+                              <w:rPr>
+                                <w:sz w:val="17"/>
+                              </w:rPr>
+                              <w:t>Molo, Iloilo, Philippines /</w:t>
+                            </w:r>
+                          </w:p>
+                          <w:p>
+                            <w:pPr>
+                              <w:pStyle w:val="ContactInfo"/>
+                              <w:spacing w:line="30" w:lineRule="atLeast"/>
+                              <w:jc w:val="left"/>
+                              <w:rPr>
+                                <w:sz w:val="17"/>
+                              </w:rPr>
+                            </w:pPr>
+                            <w:proofErr w:type="spellStart"/>
+                            <w:r>
+                              <w:rPr>
+                                <w:sz w:val="17"/>
+                              </w:rPr>
+                              <w:t>Poblacion</w:t>
+                            </w:r>
+                            <w:proofErr w:type="spellEnd"/>
+                            <w:r>
+                              <w:rPr>
+                                <w:sz w:val="17"/>
+                              </w:rPr>
+                              <w:t xml:space="preserve"> </w:t>
+                            </w:r>
+                            <w:proofErr w:type="spellStart"/>
+                            <w:r>
+                              <w:rPr>
+                                <w:sz w:val="17"/>
+                              </w:rPr>
+                              <w:t>Batad</w:t>
+                            </w:r>
+                            <w:proofErr w:type="spellEnd"/>
+                            <w:r>
+                              <w:rPr>
+                                <w:sz w:val="17"/>
+                              </w:rPr>
+                              <w:t>, Iloilo</w:t>
+                            </w:r>
+                          </w:p>
+                          <w:p>
+                            <w:pPr>
+                              <w:spacing w:line="30" w:lineRule="atLeast"/>
+                              <w:jc w:val="left"/>
+                            </w:pPr>
+                          </w:p>
                         </w:txbxContent>
                       </wps:txbx>
                       <wps:bodyPr rot="0" spcFirstLastPara="0" vertOverflow="overflow" horzOverflow="overflow" vert="horz" wrap="square" lIns="91440" tIns="45720" rIns="91440" bIns="45720" numCol="1" spcCol="0" rtlCol="0" fromWordArt="0" anchor="t" anchorCtr="0" forceAA="0" compatLnSpc="1">
@@ -2119,21 +1888,69 @@
           </mc:Choice>
           <mc:Fallback>
             <w:pict>
-              <v:shape w14:anchorId="4E93E718" id="_x0000_s1032" type="#_x0000_t202" style="position:absolute;left:0;text-align:left;margin-left:10.15pt;margin-top:209.7pt;width:144.75pt;height:21.4pt;z-index:251721728;visibility:visible;mso-wrap-style:square;mso-width-percent:0;mso-height-percent:0;mso-wrap-distance-left:9pt;mso-wrap-distance-top:0;mso-wrap-distance-right:9pt;mso-wrap-distance-bottom:0;mso-position-horizontal:absolute;mso-position-horizontal-relative:text;mso-position-vertical:absolute;mso-position-vertical-relative:text;mso-width-percent:0;mso-height-percent:0;mso-width-relative:margin;mso-height-relative:margin;v-text-anchor:top" o:gfxdata="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" filled="f" stroked="f">
+              <v:shape w14:anchorId="2DB4BE94" id="Text Box 12" o:spid="_x0000_s1032" type="#_x0000_t202" style="position:absolute;left:0;text-align:left;margin-left:14.45pt;margin-top:140.75pt;width:126.35pt;height:32.25pt;z-index:251674624;visibility:visible;mso-wrap-style:square;mso-width-percent:0;mso-height-percent:0;mso-wrap-distance-left:9pt;mso-wrap-distance-top:0;mso-wrap-distance-right:9pt;mso-wrap-distance-bottom:0;mso-position-horizontal:absolute;mso-position-horizontal-relative:text;mso-position-vertical:absolute;mso-position-vertical-relative:text;mso-width-percent:0;mso-height-percent:0;mso-width-relative:margin;mso-height-relative:margin;v-text-anchor:top" o:gfxdata="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" filled="f" stroked="f">
                 <v:textbox>
                   <w:txbxContent>
                     <w:p>
                       <w:pPr>
                         <w:pStyle w:val="ContactInfo"/>
-                      </w:pPr>
-                      <w:r>
+                        <w:spacing w:line="30" w:lineRule="atLeast"/>
+                        <w:jc w:val="left"/>
                         <w:rPr>
                           <w:sz w:val="17"/>
                         </w:rPr>
-                        <w:t>https://github.com/Shu0405-Ghost</w:t>
-                      </w:r>
-                    </w:p>
-                    <w:p/>
+                      </w:pPr>
+                      <w:r>
+                        <w:rPr>
+                          <w:sz w:val="17"/>
+                        </w:rPr>
+                        <w:t>Molo, Iloilo, Philippines /</w:t>
+                      </w:r>
+                    </w:p>
+                    <w:p>
+                      <w:pPr>
+                        <w:pStyle w:val="ContactInfo"/>
+                        <w:spacing w:line="30" w:lineRule="atLeast"/>
+                        <w:jc w:val="left"/>
+                        <w:rPr>
+                          <w:sz w:val="17"/>
+                        </w:rPr>
+                      </w:pPr>
+                      <w:proofErr w:type="spellStart"/>
+                      <w:r>
+                        <w:rPr>
+                          <w:sz w:val="17"/>
+                        </w:rPr>
+                        <w:t>Poblacion</w:t>
+                      </w:r>
+                      <w:proofErr w:type="spellEnd"/>
+                      <w:r>
+                        <w:rPr>
+                          <w:sz w:val="17"/>
+                        </w:rPr>
+                        <w:t xml:space="preserve"> </w:t>
+                      </w:r>
+                      <w:proofErr w:type="spellStart"/>
+                      <w:r>
+                        <w:rPr>
+                          <w:sz w:val="17"/>
+                        </w:rPr>
+                        <w:t>Batad</w:t>
+                      </w:r>
+                      <w:proofErr w:type="spellEnd"/>
+                      <w:r>
+                        <w:rPr>
+                          <w:sz w:val="17"/>
+                        </w:rPr>
+                        <w:t>, Iloilo</w:t>
+                      </w:r>
+                    </w:p>
+                    <w:p>
+                      <w:pPr>
+                        <w:spacing w:line="30" w:lineRule="atLeast"/>
+                        <w:jc w:val="left"/>
+                      </w:pPr>
+                    </w:p>
                   </w:txbxContent>
                 </v:textbox>
               </v:shape>
@@ -2149,18 +1966,18 @@
         <mc:AlternateContent>
           <mc:Choice Requires="wps">
             <w:drawing>
-              <wp:anchor distT="0" distB="0" distL="114300" distR="114300" simplePos="0" relativeHeight="251720704" behindDoc="0" locked="0" layoutInCell="1" allowOverlap="1" wp14:anchorId="6604ADB5" wp14:editId="7BBE6600">
+              <wp:anchor distT="0" distB="0" distL="114300" distR="114300" simplePos="0" relativeHeight="251673600" behindDoc="0" locked="0" layoutInCell="1" allowOverlap="1" wp14:anchorId="3A317D5E" wp14:editId="17A3523F">
                 <wp:simplePos x="0" y="0"/>
                 <wp:positionH relativeFrom="column">
-                  <wp:posOffset>122873</wp:posOffset>
+                  <wp:posOffset>170095</wp:posOffset>
                 </wp:positionH>
                 <wp:positionV relativeFrom="paragraph">
-                  <wp:posOffset>2253298</wp:posOffset>
+                  <wp:posOffset>1448814</wp:posOffset>
                 </wp:positionV>
-                <wp:extent cx="1604963" cy="409651"/>
+                <wp:extent cx="1798955" cy="409575"/>
                 <wp:effectExtent l="0" t="0" r="0" b="9525"/>
                 <wp:wrapNone/>
-                <wp:docPr id="780567725" name="Text Box 12"/>
+                <wp:docPr id="1540616577" name="Text Box 12"/>
                 <wp:cNvGraphicFramePr/>
                 <a:graphic xmlns:a="http://schemas.openxmlformats.org/drawingml/2006/main">
                   <a:graphicData uri="http://schemas.microsoft.com/office/word/2010/wordprocessingShape">
@@ -2169,7 +1986,7 @@
                       <wps:spPr>
                         <a:xfrm>
                           <a:off x="0" y="0"/>
-                          <a:ext cx="1604963" cy="409651"/>
+                          <a:ext cx="1798955" cy="409575"/>
                         </a:xfrm>
                         <a:prstGeom prst="rect">
                           <a:avLst/>
@@ -2199,72 +2016,44 @@
                             <w:pPr>
                               <w:pStyle w:val="ContactInfo"/>
                               <w:spacing w:line="30" w:lineRule="atLeast"/>
-                              <w:jc w:val="left"/>
-                              <w:rPr>
+                              <w:rPr>
+                                <w:color w:val="215E99" w:themeColor="text2" w:themeTint="BF"/>
                                 <w:sz w:val="17"/>
                               </w:rPr>
                             </w:pPr>
-                            <w:r>
-                              <w:rPr>
-                                <w:sz w:val="17"/>
-                              </w:rPr>
-                              <w:t xml:space="preserve">Molo, </w:t>
-                            </w:r>
-                            <w:r>
-                              <w:rPr>
-                                <w:sz w:val="17"/>
-                              </w:rPr>
-                              <w:t>Iloilo, Philippines</w:t>
-                            </w:r>
-                            <w:r>
-                              <w:rPr>
-                                <w:sz w:val="17"/>
-                              </w:rPr>
-                              <w:t xml:space="preserve"> /</w:t>
-                            </w:r>
+                            <w:hyperlink r:id="rId11" w:history="1">
+                              <w:r>
+                                <w:rPr>
+                                  <w:rStyle w:val="Hyperlink"/>
+                                  <w:color w:val="215E99" w:themeColor="text2" w:themeTint="BF"/>
+                                  <w:sz w:val="17"/>
+                                </w:rPr>
+                                <w:t>Jobe.beldad.ui@phinmaed.com /</w:t>
+                              </w:r>
+                            </w:hyperlink>
                           </w:p>
                           <w:p>
                             <w:pPr>
                               <w:pStyle w:val="ContactInfo"/>
                               <w:spacing w:line="30" w:lineRule="atLeast"/>
-                              <w:jc w:val="left"/>
-                              <w:rPr>
+                              <w:rPr>
+                                <w:color w:val="215E99" w:themeColor="text2" w:themeTint="BF"/>
                                 <w:sz w:val="17"/>
-                              </w:rPr>
-                            </w:pPr>
-                            <w:proofErr w:type="spellStart"/>
-                            <w:r>
-                              <w:rPr>
+                                <w:u w:val="single"/>
+                              </w:rPr>
+                            </w:pPr>
+                            <w:r>
+                              <w:rPr>
+                                <w:color w:val="215E99" w:themeColor="text2" w:themeTint="BF"/>
                                 <w:sz w:val="17"/>
-                              </w:rPr>
-                              <w:t>Poblacion</w:t>
-                            </w:r>
-                            <w:proofErr w:type="spellEnd"/>
-                            <w:r>
-                              <w:rPr>
-                                <w:sz w:val="17"/>
-                              </w:rPr>
-                              <w:t xml:space="preserve"> </w:t>
-                            </w:r>
-                            <w:proofErr w:type="spellStart"/>
-                            <w:r>
-                              <w:rPr>
-                                <w:sz w:val="17"/>
-                              </w:rPr>
-                              <w:t>Batad</w:t>
-                            </w:r>
-                            <w:proofErr w:type="spellEnd"/>
-                            <w:r>
-                              <w:rPr>
-                                <w:sz w:val="17"/>
-                              </w:rPr>
-                              <w:t>, Iloilo</w:t>
+                                <w:u w:val="single"/>
+                              </w:rPr>
+                              <w:t>vencbeldadjo@outlook.com</w:t>
                             </w:r>
                           </w:p>
                           <w:p>
                             <w:pPr>
                               <w:spacing w:line="30" w:lineRule="atLeast"/>
-                              <w:jc w:val="left"/>
                             </w:pPr>
                           </w:p>
                         </w:txbxContent>
@@ -2289,225 +2078,7 @@
           </mc:Choice>
           <mc:Fallback>
             <w:pict>
-              <v:shape w14:anchorId="6604ADB5" id="Text Box 12" o:spid="_x0000_s1033" type="#_x0000_t202" style="position:absolute;left:0;text-align:left;margin-left:9.7pt;margin-top:177.45pt;width:126.4pt;height:32.25pt;z-index:251720704;visibility:visible;mso-wrap-style:square;mso-width-percent:0;mso-height-percent:0;mso-wrap-distance-left:9pt;mso-wrap-distance-top:0;mso-wrap-distance-right:9pt;mso-wrap-distance-bottom:0;mso-position-horizontal:absolute;mso-position-horizontal-relative:text;mso-position-vertical:absolute;mso-position-vertical-relative:text;mso-width-percent:0;mso-height-percent:0;mso-width-relative:margin;mso-height-relative:margin;v-text-anchor:top" o:gfxdata="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" filled="f" stroked="f">
-                <v:textbox>
-                  <w:txbxContent>
-                    <w:p>
-                      <w:pPr>
-                        <w:pStyle w:val="ContactInfo"/>
-                        <w:spacing w:line="30" w:lineRule="atLeast"/>
-                        <w:jc w:val="left"/>
-                        <w:rPr>
-                          <w:sz w:val="17"/>
-                        </w:rPr>
-                      </w:pPr>
-                      <w:r>
-                        <w:rPr>
-                          <w:sz w:val="17"/>
-                        </w:rPr>
-                        <w:t xml:space="preserve">Molo, </w:t>
-                      </w:r>
-                      <w:r>
-                        <w:rPr>
-                          <w:sz w:val="17"/>
-                        </w:rPr>
-                        <w:t>Iloilo, Philippines</w:t>
-                      </w:r>
-                      <w:r>
-                        <w:rPr>
-                          <w:sz w:val="17"/>
-                        </w:rPr>
-                        <w:t xml:space="preserve"> /</w:t>
-                      </w:r>
-                    </w:p>
-                    <w:p>
-                      <w:pPr>
-                        <w:pStyle w:val="ContactInfo"/>
-                        <w:spacing w:line="30" w:lineRule="atLeast"/>
-                        <w:jc w:val="left"/>
-                        <w:rPr>
-                          <w:sz w:val="17"/>
-                        </w:rPr>
-                      </w:pPr>
-                      <w:proofErr w:type="spellStart"/>
-                      <w:r>
-                        <w:rPr>
-                          <w:sz w:val="17"/>
-                        </w:rPr>
-                        <w:t>Poblacion</w:t>
-                      </w:r>
-                      <w:proofErr w:type="spellEnd"/>
-                      <w:r>
-                        <w:rPr>
-                          <w:sz w:val="17"/>
-                        </w:rPr>
-                        <w:t xml:space="preserve"> </w:t>
-                      </w:r>
-                      <w:proofErr w:type="spellStart"/>
-                      <w:r>
-                        <w:rPr>
-                          <w:sz w:val="17"/>
-                        </w:rPr>
-                        <w:t>Batad</w:t>
-                      </w:r>
-                      <w:proofErr w:type="spellEnd"/>
-                      <w:r>
-                        <w:rPr>
-                          <w:sz w:val="17"/>
-                        </w:rPr>
-                        <w:t>, Iloilo</w:t>
-                      </w:r>
-                    </w:p>
-                    <w:p>
-                      <w:pPr>
-                        <w:spacing w:line="30" w:lineRule="atLeast"/>
-                        <w:jc w:val="left"/>
-                      </w:pPr>
-                    </w:p>
-                  </w:txbxContent>
-                </v:textbox>
-              </v:shape>
-            </w:pict>
-          </mc:Fallback>
-        </mc:AlternateContent>
-      </w:r>
-      <w:r>
-        <w:rPr>
-          <w:noProof/>
-          <w:vertAlign w:val="subscript"/>
-        </w:rPr>
-        <mc:AlternateContent>
-          <mc:Choice Requires="wps">
-            <w:drawing>
-              <wp:anchor distT="0" distB="0" distL="114300" distR="114300" simplePos="0" relativeHeight="251718656" behindDoc="0" locked="0" layoutInCell="1" allowOverlap="1" wp14:anchorId="570058EA" wp14:editId="11AA037C">
-                <wp:simplePos x="0" y="0"/>
-                <wp:positionH relativeFrom="column">
-                  <wp:posOffset>113386</wp:posOffset>
-                </wp:positionH>
-                <wp:positionV relativeFrom="paragraph">
-                  <wp:posOffset>1913611</wp:posOffset>
-                </wp:positionV>
-                <wp:extent cx="1799539" cy="409651"/>
-                <wp:effectExtent l="0" t="0" r="0" b="9525"/>
-                <wp:wrapNone/>
-                <wp:docPr id="1540616577" name="Text Box 12"/>
-                <wp:cNvGraphicFramePr/>
-                <a:graphic xmlns:a="http://schemas.openxmlformats.org/drawingml/2006/main">
-                  <a:graphicData uri="http://schemas.microsoft.com/office/word/2010/wordprocessingShape">
-                    <wps:wsp>
-                      <wps:cNvSpPr txBox="1"/>
-                      <wps:spPr>
-                        <a:xfrm>
-                          <a:off x="0" y="0"/>
-                          <a:ext cx="1799539" cy="409651"/>
-                        </a:xfrm>
-                        <a:prstGeom prst="rect">
-                          <a:avLst/>
-                        </a:prstGeom>
-                        <a:noFill/>
-                        <a:ln>
-                          <a:noFill/>
-                        </a:ln>
-                      </wps:spPr>
-                      <wps:style>
-                        <a:lnRef idx="0">
-                          <a:scrgbClr r="0" g="0" b="0"/>
-                        </a:lnRef>
-                        <a:fillRef idx="0">
-                          <a:scrgbClr r="0" g="0" b="0"/>
-                        </a:fillRef>
-                        <a:effectRef idx="0">
-                          <a:scrgbClr r="0" g="0" b="0"/>
-                        </a:effectRef>
-                        <a:fontRef idx="minor">
-                          <a:schemeClr val="dk1"/>
-                        </a:fontRef>
-                      </wps:style>
-                      <wps:txbx>
-                        <w:txbxContent>
-                          <w:p>
-                            <w:pPr>
-                              <w:pStyle w:val="ContactInfo"/>
-                              <w:spacing w:line="30" w:lineRule="atLeast"/>
-                              <w:rPr>
-                                <w:color w:val="215E99" w:themeColor="text2" w:themeTint="BF"/>
-                                <w:sz w:val="17"/>
-                              </w:rPr>
-                            </w:pPr>
-                            <w:hyperlink r:id="rId11" w:history="1">
-                              <w:r>
-                                <w:rPr>
-                                  <w:rStyle w:val="Hyperlink"/>
-                                  <w:color w:val="215E99" w:themeColor="text2" w:themeTint="BF"/>
-                                  <w:sz w:val="17"/>
-                                </w:rPr>
-                                <w:t>Jobe.beldad.ui@phinmaed.com</w:t>
-                              </w:r>
-                              <w:r>
-                                <w:rPr>
-                                  <w:rStyle w:val="Hyperlink"/>
-                                  <w:color w:val="215E99" w:themeColor="text2" w:themeTint="BF"/>
-                                  <w:sz w:val="17"/>
-                                </w:rPr>
-                                <w:t xml:space="preserve"> </w:t>
-                              </w:r>
-                              <w:r>
-                                <w:rPr>
-                                  <w:rStyle w:val="Hyperlink"/>
-                                  <w:color w:val="215E99" w:themeColor="text2" w:themeTint="BF"/>
-                                  <w:sz w:val="17"/>
-                                </w:rPr>
-                                <w:t>/</w:t>
-                              </w:r>
-                            </w:hyperlink>
-                          </w:p>
-                          <w:p>
-                            <w:pPr>
-                              <w:pStyle w:val="ContactInfo"/>
-                              <w:spacing w:line="30" w:lineRule="atLeast"/>
-                              <w:rPr>
-                                <w:color w:val="215E99" w:themeColor="text2" w:themeTint="BF"/>
-                                <w:sz w:val="17"/>
-                                <w:u w:val="single"/>
-                              </w:rPr>
-                            </w:pPr>
-                            <w:r>
-                              <w:rPr>
-                                <w:color w:val="215E99" w:themeColor="text2" w:themeTint="BF"/>
-                                <w:sz w:val="17"/>
-                                <w:u w:val="single"/>
-                              </w:rPr>
-                              <w:t>vencbeldadjo@outlook.com</w:t>
-                            </w:r>
-                          </w:p>
-                          <w:p>
-                            <w:pPr>
-                              <w:spacing w:line="30" w:lineRule="atLeast"/>
-                            </w:pPr>
-                          </w:p>
-                        </w:txbxContent>
-                      </wps:txbx>
-                      <wps:bodyPr rot="0" spcFirstLastPara="0" vertOverflow="overflow" horzOverflow="overflow" vert="horz" wrap="square" lIns="91440" tIns="45720" rIns="91440" bIns="45720" numCol="1" spcCol="0" rtlCol="0" fromWordArt="0" anchor="t" anchorCtr="0" forceAA="0" compatLnSpc="1">
-                        <a:prstTxWarp prst="textNoShape">
-                          <a:avLst/>
-                        </a:prstTxWarp>
-                        <a:noAutofit/>
-                      </wps:bodyPr>
-                    </wps:wsp>
-                  </a:graphicData>
-                </a:graphic>
-                <wp14:sizeRelH relativeFrom="margin">
-                  <wp14:pctWidth>0</wp14:pctWidth>
-                </wp14:sizeRelH>
-                <wp14:sizeRelV relativeFrom="margin">
-                  <wp14:pctHeight>0</wp14:pctHeight>
-                </wp14:sizeRelV>
-              </wp:anchor>
-            </w:drawing>
-          </mc:Choice>
-          <mc:Fallback>
-            <w:pict>
-              <v:shape w14:anchorId="570058EA" id="_x0000_s1034" type="#_x0000_t202" style="position:absolute;left:0;text-align:left;margin-left:8.95pt;margin-top:150.7pt;width:141.7pt;height:32.25pt;z-index:251718656;visibility:visible;mso-wrap-style:square;mso-width-percent:0;mso-height-percent:0;mso-wrap-distance-left:9pt;mso-wrap-distance-top:0;mso-wrap-distance-right:9pt;mso-wrap-distance-bottom:0;mso-position-horizontal:absolute;mso-position-horizontal-relative:text;mso-position-vertical:absolute;mso-position-vertical-relative:text;mso-width-percent:0;mso-height-percent:0;mso-width-relative:margin;mso-height-relative:margin;v-text-anchor:top" o:gfxdata="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" filled="f" stroked="f">
+              <v:shape w14:anchorId="3A317D5E" id="_x0000_s1033" type="#_x0000_t202" style="position:absolute;left:0;text-align:left;margin-left:13.4pt;margin-top:114.1pt;width:141.65pt;height:32.25pt;z-index:251673600;visibility:visible;mso-wrap-style:square;mso-width-percent:0;mso-height-percent:0;mso-wrap-distance-left:9pt;mso-wrap-distance-top:0;mso-wrap-distance-right:9pt;mso-wrap-distance-bottom:0;mso-position-horizontal:absolute;mso-position-horizontal-relative:text;mso-position-vertical:absolute;mso-position-vertical-relative:text;mso-width-percent:0;mso-height-percent:0;mso-width-relative:margin;mso-height-relative:margin;v-text-anchor:top" o:gfxdata="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" filled="f" stroked="f">
                 <v:textbox>
                   <w:txbxContent>
                     <w:p>
@@ -2526,23 +2097,7 @@
                             <w:color w:val="215E99" w:themeColor="text2" w:themeTint="BF"/>
                             <w:sz w:val="17"/>
                           </w:rPr>
-                          <w:t>Jobe.beldad.ui@phinmaed.com</w:t>
-                        </w:r>
-                        <w:r>
-                          <w:rPr>
-                            <w:rStyle w:val="Hyperlink"/>
-                            <w:color w:val="215E99" w:themeColor="text2" w:themeTint="BF"/>
-                            <w:sz w:val="17"/>
-                          </w:rPr>
-                          <w:t xml:space="preserve"> </w:t>
-                        </w:r>
-                        <w:r>
-                          <w:rPr>
-                            <w:rStyle w:val="Hyperlink"/>
-                            <w:color w:val="215E99" w:themeColor="text2" w:themeTint="BF"/>
-                            <w:sz w:val="17"/>
-                          </w:rPr>
-                          <w:t>/</w:t>
+                          <w:t>Jobe.beldad.ui@phinmaed.com /</w:t>
                         </w:r>
                       </w:hyperlink>
                     </w:p>
@@ -2570,529 +2125,6 @@
                         <w:spacing w:line="30" w:lineRule="atLeast"/>
                       </w:pPr>
                     </w:p>
-                  </w:txbxContent>
-                </v:textbox>
-              </v:shape>
-            </w:pict>
-          </mc:Fallback>
-        </mc:AlternateContent>
-      </w:r>
-      <w:r>
-        <w:rPr>
-          <w:noProof/>
-          <w:vertAlign w:val="subscript"/>
-        </w:rPr>
-        <mc:AlternateContent>
-          <mc:Choice Requires="wps">
-            <w:drawing>
-              <wp:anchor distT="0" distB="0" distL="114300" distR="114300" simplePos="0" relativeHeight="251716608" behindDoc="0" locked="0" layoutInCell="1" allowOverlap="1" wp14:anchorId="7CC2B31E" wp14:editId="0F08502E">
-                <wp:simplePos x="0" y="0"/>
-                <wp:positionH relativeFrom="column">
-                  <wp:posOffset>113131</wp:posOffset>
-                </wp:positionH>
-                <wp:positionV relativeFrom="paragraph">
-                  <wp:posOffset>1664335</wp:posOffset>
-                </wp:positionV>
-                <wp:extent cx="1464615" cy="212141"/>
-                <wp:effectExtent l="0" t="0" r="0" b="0"/>
-                <wp:wrapNone/>
-                <wp:docPr id="1900646436" name="Text Box 12"/>
-                <wp:cNvGraphicFramePr/>
-                <a:graphic xmlns:a="http://schemas.openxmlformats.org/drawingml/2006/main">
-                  <a:graphicData uri="http://schemas.microsoft.com/office/word/2010/wordprocessingShape">
-                    <wps:wsp>
-                      <wps:cNvSpPr txBox="1"/>
-                      <wps:spPr>
-                        <a:xfrm>
-                          <a:off x="0" y="0"/>
-                          <a:ext cx="1464615" cy="212141"/>
-                        </a:xfrm>
-                        <a:prstGeom prst="rect">
-                          <a:avLst/>
-                        </a:prstGeom>
-                        <a:noFill/>
-                        <a:ln>
-                          <a:noFill/>
-                        </a:ln>
-                      </wps:spPr>
-                      <wps:style>
-                        <a:lnRef idx="0">
-                          <a:scrgbClr r="0" g="0" b="0"/>
-                        </a:lnRef>
-                        <a:fillRef idx="0">
-                          <a:scrgbClr r="0" g="0" b="0"/>
-                        </a:fillRef>
-                        <a:effectRef idx="0">
-                          <a:scrgbClr r="0" g="0" b="0"/>
-                        </a:effectRef>
-                        <a:fontRef idx="minor">
-                          <a:schemeClr val="dk1"/>
-                        </a:fontRef>
-                      </wps:style>
-                      <wps:txbx>
-                        <w:txbxContent>
-                          <w:p>
-                            <w:r>
-                              <w:rPr>
-                                <w:sz w:val="17"/>
-                              </w:rPr>
-                              <w:t>09123456789</w:t>
-                            </w:r>
-                          </w:p>
-                        </w:txbxContent>
-                      </wps:txbx>
-                      <wps:bodyPr rot="0" spcFirstLastPara="0" vertOverflow="overflow" horzOverflow="overflow" vert="horz" wrap="square" lIns="91440" tIns="45720" rIns="91440" bIns="45720" numCol="1" spcCol="0" rtlCol="0" fromWordArt="0" anchor="t" anchorCtr="0" forceAA="0" compatLnSpc="1">
-                        <a:prstTxWarp prst="textNoShape">
-                          <a:avLst/>
-                        </a:prstTxWarp>
-                        <a:noAutofit/>
-                      </wps:bodyPr>
-                    </wps:wsp>
-                  </a:graphicData>
-                </a:graphic>
-                <wp14:sizeRelV relativeFrom="margin">
-                  <wp14:pctHeight>0</wp14:pctHeight>
-                </wp14:sizeRelV>
-              </wp:anchor>
-            </w:drawing>
-          </mc:Choice>
-          <mc:Fallback>
-            <w:pict>
-              <v:shape w14:anchorId="7CC2B31E" id="_x0000_s1035" type="#_x0000_t202" style="position:absolute;left:0;text-align:left;margin-left:8.9pt;margin-top:131.05pt;width:115.3pt;height:16.7pt;z-index:251716608;visibility:visible;mso-wrap-style:square;mso-height-percent:0;mso-wrap-distance-left:9pt;mso-wrap-distance-top:0;mso-wrap-distance-right:9pt;mso-wrap-distance-bottom:0;mso-position-horizontal:absolute;mso-position-horizontal-relative:text;mso-position-vertical:absolute;mso-position-vertical-relative:text;mso-height-percent:0;mso-height-relative:margin;v-text-anchor:top" o:gfxdata="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" filled="f" stroked="f">
-                <v:textbox>
-                  <w:txbxContent>
-                    <w:p>
-                      <w:r>
-                        <w:rPr>
-                          <w:sz w:val="17"/>
-                        </w:rPr>
-                        <w:t>09123456789</w:t>
-                      </w:r>
-                    </w:p>
-                  </w:txbxContent>
-                </v:textbox>
-              </v:shape>
-            </w:pict>
-          </mc:Fallback>
-        </mc:AlternateContent>
-      </w:r>
-      <w:r>
-        <w:rPr>
-          <w:noProof/>
-          <w:vertAlign w:val="subscript"/>
-        </w:rPr>
-        <mc:AlternateContent>
-          <mc:Choice Requires="wps">
-            <w:drawing>
-              <wp:anchor distT="0" distB="0" distL="114300" distR="114300" simplePos="0" relativeHeight="251715584" behindDoc="0" locked="0" layoutInCell="1" allowOverlap="1" wp14:anchorId="76A5318A" wp14:editId="30EA493F">
-                <wp:simplePos x="0" y="0"/>
-                <wp:positionH relativeFrom="column">
-                  <wp:posOffset>4492625</wp:posOffset>
-                </wp:positionH>
-                <wp:positionV relativeFrom="paragraph">
-                  <wp:posOffset>7403465</wp:posOffset>
-                </wp:positionV>
-                <wp:extent cx="2159000" cy="615950"/>
-                <wp:effectExtent l="0" t="0" r="0" b="0"/>
-                <wp:wrapNone/>
-                <wp:docPr id="1270361470" name="Text Box 3"/>
-                <wp:cNvGraphicFramePr/>
-                <a:graphic xmlns:a="http://schemas.openxmlformats.org/drawingml/2006/main">
-                  <a:graphicData uri="http://schemas.microsoft.com/office/word/2010/wordprocessingShape">
-                    <wps:wsp>
-                      <wps:cNvSpPr txBox="1"/>
-                      <wps:spPr>
-                        <a:xfrm>
-                          <a:off x="0" y="0"/>
-                          <a:ext cx="2159000" cy="615950"/>
-                        </a:xfrm>
-                        <a:prstGeom prst="rect">
-                          <a:avLst/>
-                        </a:prstGeom>
-                        <a:solidFill>
-                          <a:schemeClr val="lt1"/>
-                        </a:solidFill>
-                        <a:ln w="6350">
-                          <a:noFill/>
-                        </a:ln>
-                      </wps:spPr>
-                      <wps:txbx>
-                        <w:txbxContent>
-                          <w:p>
-                            <w:pPr>
-                              <w:pStyle w:val="ListBullet"/>
-                              <w:numPr>
-                                <w:ilvl w:val="0"/>
-                                <w:numId w:val="0"/>
-                              </w:numPr>
-                              <w:ind w:left="720" w:hanging="360"/>
-                              <w:rPr>
-                                <w:szCs w:val="22"/>
-                              </w:rPr>
-                            </w:pPr>
-                            <w:r>
-                              <w:rPr>
-                                <w:szCs w:val="22"/>
-                              </w:rPr>
-                              <w:t xml:space="preserve">Dean Seth DA. </w:t>
-                            </w:r>
-                            <w:proofErr w:type="spellStart"/>
-                            <w:proofErr w:type="gramStart"/>
-                            <w:r>
-                              <w:rPr>
-                                <w:szCs w:val="22"/>
-                              </w:rPr>
-                              <w:t>Nono,MSCS</w:t>
-                            </w:r>
-                            <w:proofErr w:type="spellEnd"/>
-                            <w:proofErr w:type="gramEnd"/>
-                          </w:p>
-                          <w:p>
-                            <w:pPr>
-                              <w:pStyle w:val="ListBullet"/>
-                              <w:numPr>
-                                <w:ilvl w:val="0"/>
-                                <w:numId w:val="0"/>
-                              </w:numPr>
-                              <w:ind w:left="720" w:hanging="360"/>
-                              <w:rPr>
-                                <w:szCs w:val="22"/>
-                              </w:rPr>
-                            </w:pPr>
-                            <w:r>
-                              <w:rPr>
-                                <w:szCs w:val="22"/>
-                              </w:rPr>
-                              <w:t>DEAN</w:t>
-                            </w:r>
-                            <w:r>
-                              <w:rPr>
-                                <w:szCs w:val="22"/>
-                              </w:rPr>
-                              <w:t>, CITE</w:t>
-                            </w:r>
-                          </w:p>
-                          <w:p>
-                            <w:pPr>
-                              <w:pStyle w:val="ListBullet"/>
-                              <w:numPr>
-                                <w:ilvl w:val="0"/>
-                                <w:numId w:val="0"/>
-                              </w:numPr>
-                              <w:ind w:left="720" w:hanging="360"/>
-                              <w:rPr>
-                                <w:szCs w:val="22"/>
-                              </w:rPr>
-                            </w:pPr>
-                            <w:r>
-                              <w:rPr>
-                                <w:szCs w:val="22"/>
-                              </w:rPr>
-                              <w:t>0</w:t>
-                            </w:r>
-                            <w:r>
-                              <w:rPr>
-                                <w:szCs w:val="22"/>
-                              </w:rPr>
-                              <w:t>9----------</w:t>
-                            </w:r>
-                          </w:p>
-                          <w:p/>
-                        </w:txbxContent>
-                      </wps:txbx>
-                      <wps:bodyPr rot="0" spcFirstLastPara="0" vertOverflow="overflow" horzOverflow="overflow" vert="horz" wrap="square" lIns="91440" tIns="45720" rIns="91440" bIns="45720" numCol="1" spcCol="0" rtlCol="0" fromWordArt="0" anchor="t" anchorCtr="0" forceAA="0" compatLnSpc="1">
-                        <a:prstTxWarp prst="textNoShape">
-                          <a:avLst/>
-                        </a:prstTxWarp>
-                        <a:noAutofit/>
-                      </wps:bodyPr>
-                    </wps:wsp>
-                  </a:graphicData>
-                </a:graphic>
-                <wp14:sizeRelH relativeFrom="margin">
-                  <wp14:pctWidth>0</wp14:pctWidth>
-                </wp14:sizeRelH>
-                <wp14:sizeRelV relativeFrom="margin">
-                  <wp14:pctHeight>0</wp14:pctHeight>
-                </wp14:sizeRelV>
-              </wp:anchor>
-            </w:drawing>
-          </mc:Choice>
-          <mc:Fallback>
-            <w:pict>
-              <v:shape w14:anchorId="76A5318A" id="Text Box 3" o:spid="_x0000_s1036" type="#_x0000_t202" style="position:absolute;left:0;text-align:left;margin-left:353.75pt;margin-top:582.95pt;width:170pt;height:48.5pt;z-index:251715584;visibility:visible;mso-wrap-style:square;mso-width-percent:0;mso-height-percent:0;mso-wrap-distance-left:9pt;mso-wrap-distance-top:0;mso-wrap-distance-right:9pt;mso-wrap-distance-bottom:0;mso-position-horizontal:absolute;mso-position-horizontal-relative:text;mso-position-vertical:absolute;mso-position-vertical-relative:text;mso-width-percent:0;mso-height-percent:0;mso-width-relative:margin;mso-height-relative:margin;v-text-anchor:top" o:gfxdata="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" fillcolor="white [3201]" stroked="f" strokeweight=".5pt">
-                <v:textbox>
-                  <w:txbxContent>
-                    <w:p>
-                      <w:pPr>
-                        <w:pStyle w:val="ListBullet"/>
-                        <w:numPr>
-                          <w:ilvl w:val="0"/>
-                          <w:numId w:val="0"/>
-                        </w:numPr>
-                        <w:ind w:left="720" w:hanging="360"/>
-                        <w:rPr>
-                          <w:szCs w:val="22"/>
-                        </w:rPr>
-                      </w:pPr>
-                      <w:r>
-                        <w:rPr>
-                          <w:szCs w:val="22"/>
-                        </w:rPr>
-                        <w:t xml:space="preserve">Dean Seth DA. </w:t>
-                      </w:r>
-                      <w:proofErr w:type="spellStart"/>
-                      <w:proofErr w:type="gramStart"/>
-                      <w:r>
-                        <w:rPr>
-                          <w:szCs w:val="22"/>
-                        </w:rPr>
-                        <w:t>Nono,MSCS</w:t>
-                      </w:r>
-                      <w:proofErr w:type="spellEnd"/>
-                      <w:proofErr w:type="gramEnd"/>
-                    </w:p>
-                    <w:p>
-                      <w:pPr>
-                        <w:pStyle w:val="ListBullet"/>
-                        <w:numPr>
-                          <w:ilvl w:val="0"/>
-                          <w:numId w:val="0"/>
-                        </w:numPr>
-                        <w:ind w:left="720" w:hanging="360"/>
-                        <w:rPr>
-                          <w:szCs w:val="22"/>
-                        </w:rPr>
-                      </w:pPr>
-                      <w:r>
-                        <w:rPr>
-                          <w:szCs w:val="22"/>
-                        </w:rPr>
-                        <w:t>DEAN</w:t>
-                      </w:r>
-                      <w:r>
-                        <w:rPr>
-                          <w:szCs w:val="22"/>
-                        </w:rPr>
-                        <w:t>, CITE</w:t>
-                      </w:r>
-                    </w:p>
-                    <w:p>
-                      <w:pPr>
-                        <w:pStyle w:val="ListBullet"/>
-                        <w:numPr>
-                          <w:ilvl w:val="0"/>
-                          <w:numId w:val="0"/>
-                        </w:numPr>
-                        <w:ind w:left="720" w:hanging="360"/>
-                        <w:rPr>
-                          <w:szCs w:val="22"/>
-                        </w:rPr>
-                      </w:pPr>
-                      <w:r>
-                        <w:rPr>
-                          <w:szCs w:val="22"/>
-                        </w:rPr>
-                        <w:t>0</w:t>
-                      </w:r>
-                      <w:r>
-                        <w:rPr>
-                          <w:szCs w:val="22"/>
-                        </w:rPr>
-                        <w:t>9----------</w:t>
-                      </w:r>
-                    </w:p>
-                    <w:p/>
-                  </w:txbxContent>
-                </v:textbox>
-              </v:shape>
-            </w:pict>
-          </mc:Fallback>
-        </mc:AlternateContent>
-      </w:r>
-      <w:r>
-        <w:rPr>
-          <w:noProof/>
-          <w:vertAlign w:val="subscript"/>
-        </w:rPr>
-        <mc:AlternateContent>
-          <mc:Choice Requires="wps">
-            <w:drawing>
-              <wp:anchor distT="0" distB="0" distL="114300" distR="114300" simplePos="0" relativeHeight="251713536" behindDoc="0" locked="0" layoutInCell="1" allowOverlap="1" wp14:anchorId="1D4362FA" wp14:editId="7659B71E">
-                <wp:simplePos x="0" y="0"/>
-                <wp:positionH relativeFrom="column">
-                  <wp:posOffset>2209800</wp:posOffset>
-                </wp:positionH>
-                <wp:positionV relativeFrom="paragraph">
-                  <wp:posOffset>7349490</wp:posOffset>
-                </wp:positionV>
-                <wp:extent cx="1905000" cy="615950"/>
-                <wp:effectExtent l="0" t="0" r="0" b="0"/>
-                <wp:wrapNone/>
-                <wp:docPr id="2077883036" name="Text Box 3"/>
-                <wp:cNvGraphicFramePr/>
-                <a:graphic xmlns:a="http://schemas.openxmlformats.org/drawingml/2006/main">
-                  <a:graphicData uri="http://schemas.microsoft.com/office/word/2010/wordprocessingShape">
-                    <wps:wsp>
-                      <wps:cNvSpPr txBox="1"/>
-                      <wps:spPr>
-                        <a:xfrm>
-                          <a:off x="0" y="0"/>
-                          <a:ext cx="1905000" cy="615950"/>
-                        </a:xfrm>
-                        <a:prstGeom prst="rect">
-                          <a:avLst/>
-                        </a:prstGeom>
-                        <a:solidFill>
-                          <a:schemeClr val="lt1"/>
-                        </a:solidFill>
-                        <a:ln w="6350">
-                          <a:noFill/>
-                        </a:ln>
-                      </wps:spPr>
-                      <wps:txbx>
-                        <w:txbxContent>
-                          <w:p>
-                            <w:pPr>
-                              <w:pStyle w:val="ListBullet"/>
-                              <w:numPr>
-                                <w:ilvl w:val="0"/>
-                                <w:numId w:val="0"/>
-                              </w:numPr>
-                              <w:ind w:left="720" w:hanging="360"/>
-                              <w:rPr>
-                                <w:szCs w:val="22"/>
-                              </w:rPr>
-                            </w:pPr>
-                            <w:r>
-                              <w:rPr>
-                                <w:szCs w:val="22"/>
-                              </w:rPr>
-                              <w:t>Ms. Jocel C. Gallo, MBA</w:t>
-                            </w:r>
-                          </w:p>
-                          <w:p>
-                            <w:pPr>
-                              <w:pStyle w:val="ListBullet"/>
-                              <w:numPr>
-                                <w:ilvl w:val="0"/>
-                                <w:numId w:val="0"/>
-                              </w:numPr>
-                              <w:ind w:left="720" w:hanging="360"/>
-                              <w:rPr>
-                                <w:szCs w:val="22"/>
-                              </w:rPr>
-                            </w:pPr>
-                            <w:r>
-                              <w:rPr>
-                                <w:szCs w:val="22"/>
-                              </w:rPr>
-                              <w:t>Teacher, CITE</w:t>
-                            </w:r>
-                          </w:p>
-                          <w:p>
-                            <w:pPr>
-                              <w:pStyle w:val="ListBullet"/>
-                              <w:numPr>
-                                <w:ilvl w:val="0"/>
-                                <w:numId w:val="0"/>
-                              </w:numPr>
-                              <w:ind w:left="720" w:hanging="360"/>
-                              <w:rPr>
-                                <w:szCs w:val="22"/>
-                              </w:rPr>
-                            </w:pPr>
-                            <w:r>
-                              <w:rPr>
-                                <w:szCs w:val="22"/>
-                              </w:rPr>
-                              <w:t>09673060018</w:t>
-                            </w:r>
-                          </w:p>
-                          <w:p/>
-                        </w:txbxContent>
-                      </wps:txbx>
-                      <wps:bodyPr rot="0" spcFirstLastPara="0" vertOverflow="overflow" horzOverflow="overflow" vert="horz" wrap="square" lIns="91440" tIns="45720" rIns="91440" bIns="45720" numCol="1" spcCol="0" rtlCol="0" fromWordArt="0" anchor="t" anchorCtr="0" forceAA="0" compatLnSpc="1">
-                        <a:prstTxWarp prst="textNoShape">
-                          <a:avLst/>
-                        </a:prstTxWarp>
-                        <a:noAutofit/>
-                      </wps:bodyPr>
-                    </wps:wsp>
-                  </a:graphicData>
-                </a:graphic>
-                <wp14:sizeRelH relativeFrom="margin">
-                  <wp14:pctWidth>0</wp14:pctWidth>
-                </wp14:sizeRelH>
-                <wp14:sizeRelV relativeFrom="margin">
-                  <wp14:pctHeight>0</wp14:pctHeight>
-                </wp14:sizeRelV>
-              </wp:anchor>
-            </w:drawing>
-          </mc:Choice>
-          <mc:Fallback>
-            <w:pict>
-              <v:shape w14:anchorId="1D4362FA" id="_x0000_s1037" type="#_x0000_t202" style="position:absolute;left:0;text-align:left;margin-left:174pt;margin-top:578.7pt;width:150pt;height:48.5pt;z-index:251713536;visibility:visible;mso-wrap-style:square;mso-width-percent:0;mso-height-percent:0;mso-wrap-distance-left:9pt;mso-wrap-distance-top:0;mso-wrap-distance-right:9pt;mso-wrap-distance-bottom:0;mso-position-horizontal:absolute;mso-position-horizontal-relative:text;mso-position-vertical:absolute;mso-position-vertical-relative:text;mso-width-percent:0;mso-height-percent:0;mso-width-relative:margin;mso-height-relative:margin;v-text-anchor:top" o:gfxdata="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" fillcolor="white [3201]" stroked="f" strokeweight=".5pt">
-                <v:textbox>
-                  <w:txbxContent>
-                    <w:p>
-                      <w:pPr>
-                        <w:pStyle w:val="ListBullet"/>
-                        <w:numPr>
-                          <w:ilvl w:val="0"/>
-                          <w:numId w:val="0"/>
-                        </w:numPr>
-                        <w:ind w:left="720" w:hanging="360"/>
-                        <w:rPr>
-                          <w:szCs w:val="22"/>
-                        </w:rPr>
-                      </w:pPr>
-                      <w:r>
-                        <w:rPr>
-                          <w:szCs w:val="22"/>
-                        </w:rPr>
-                        <w:t>Ms. Jocel C. Gallo, MBA</w:t>
-                      </w:r>
-                    </w:p>
-                    <w:p>
-                      <w:pPr>
-                        <w:pStyle w:val="ListBullet"/>
-                        <w:numPr>
-                          <w:ilvl w:val="0"/>
-                          <w:numId w:val="0"/>
-                        </w:numPr>
-                        <w:ind w:left="720" w:hanging="360"/>
-                        <w:rPr>
-                          <w:szCs w:val="22"/>
-                        </w:rPr>
-                      </w:pPr>
-                      <w:r>
-                        <w:rPr>
-                          <w:szCs w:val="22"/>
-                        </w:rPr>
-                        <w:t>Teacher, CITE</w:t>
-                      </w:r>
-                    </w:p>
-                    <w:p>
-                      <w:pPr>
-                        <w:pStyle w:val="ListBullet"/>
-                        <w:numPr>
-                          <w:ilvl w:val="0"/>
-                          <w:numId w:val="0"/>
-                        </w:numPr>
-                        <w:ind w:left="720" w:hanging="360"/>
-                        <w:rPr>
-                          <w:szCs w:val="22"/>
-                        </w:rPr>
-                      </w:pPr>
-                      <w:r>
-                        <w:rPr>
-                          <w:szCs w:val="22"/>
-                        </w:rPr>
-                        <w:t>09673060018</w:t>
-                      </w:r>
-                    </w:p>
-                    <w:p/>
                   </w:txbxContent>
                 </v:textbox>
               </v:shape>
@@ -3106,18 +2138,18 @@
           <w:vertAlign w:val="subscript"/>
         </w:rPr>
         <w:drawing>
-          <wp:anchor distT="0" distB="0" distL="114300" distR="114300" simplePos="0" relativeHeight="251701248" behindDoc="0" locked="0" layoutInCell="1" allowOverlap="1" wp14:anchorId="0FE08D23" wp14:editId="32603F90">
+          <wp:anchor distT="0" distB="0" distL="114300" distR="114300" simplePos="0" relativeHeight="251663360" behindDoc="0" locked="0" layoutInCell="1" allowOverlap="1" wp14:anchorId="6F96FF38" wp14:editId="0EC9FA5D">
             <wp:simplePos x="0" y="0"/>
-            <wp:positionH relativeFrom="column">
-              <wp:posOffset>-44450</wp:posOffset>
+            <wp:positionH relativeFrom="margin">
+              <wp:align>left</wp:align>
             </wp:positionH>
             <wp:positionV relativeFrom="paragraph">
-              <wp:posOffset>1975485</wp:posOffset>
+              <wp:posOffset>1904346</wp:posOffset>
             </wp:positionV>
             <wp:extent cx="170815" cy="168275"/>
             <wp:effectExtent l="0" t="0" r="635" b="3175"/>
-            <wp:wrapSquare wrapText="bothSides"/>
-            <wp:docPr id="1995391606" name="Graphic 22"/>
+            <wp:wrapNone/>
+            <wp:docPr id="468311472" name="Graphic 23"/>
             <wp:cNvGraphicFramePr>
               <a:graphicFrameLocks xmlns:a="http://schemas.openxmlformats.org/drawingml/2006/main" noChangeAspect="1"/>
             </wp:cNvGraphicFramePr>
@@ -3125,7 +2157,7 @@
               <a:graphicData uri="http://schemas.openxmlformats.org/drawingml/2006/picture">
                 <pic:pic xmlns:pic="http://schemas.openxmlformats.org/drawingml/2006/picture">
                   <pic:nvPicPr>
-                    <pic:cNvPr id="1995391606" name="Graphic 22"/>
+                    <pic:cNvPr id="468311472" name="Graphic 23"/>
                     <pic:cNvPicPr>
                       <a:picLocks noChangeAspect="1"/>
                     </pic:cNvPicPr>
@@ -3166,18 +2198,18 @@
           <w:vertAlign w:val="subscript"/>
         </w:rPr>
         <w:drawing>
-          <wp:anchor distT="0" distB="0" distL="114300" distR="114300" simplePos="0" relativeHeight="251700224" behindDoc="0" locked="0" layoutInCell="1" allowOverlap="1" wp14:anchorId="01DFEE00" wp14:editId="676CD5BF">
+          <wp:anchor distT="0" distB="0" distL="114300" distR="114300" simplePos="0" relativeHeight="251662336" behindDoc="0" locked="0" layoutInCell="1" allowOverlap="1" wp14:anchorId="75966E5D" wp14:editId="2714E8E9">
             <wp:simplePos x="0" y="0"/>
-            <wp:positionH relativeFrom="column">
-              <wp:posOffset>-44450</wp:posOffset>
+            <wp:positionH relativeFrom="margin">
+              <wp:align>left</wp:align>
             </wp:positionH>
             <wp:positionV relativeFrom="paragraph">
-              <wp:posOffset>1675765</wp:posOffset>
+              <wp:posOffset>1576686</wp:posOffset>
             </wp:positionV>
-            <wp:extent cx="170815" cy="168553"/>
+            <wp:extent cx="170815" cy="168275"/>
             <wp:effectExtent l="0" t="0" r="635" b="3175"/>
-            <wp:wrapSquare wrapText="bothSides"/>
-            <wp:docPr id="1935713608" name="Graphic 19"/>
+            <wp:wrapNone/>
+            <wp:docPr id="1995391606" name="Graphic 22"/>
             <wp:cNvGraphicFramePr>
               <a:graphicFrameLocks xmlns:a="http://schemas.openxmlformats.org/drawingml/2006/main" noChangeAspect="1"/>
             </wp:cNvGraphicFramePr>
@@ -3185,7 +2217,7 @@
               <a:graphicData uri="http://schemas.openxmlformats.org/drawingml/2006/picture">
                 <pic:pic xmlns:pic="http://schemas.openxmlformats.org/drawingml/2006/picture">
                   <pic:nvPicPr>
-                    <pic:cNvPr id="1935713608" name="Graphic 19"/>
+                    <pic:cNvPr id="1995391606" name="Graphic 22"/>
                     <pic:cNvPicPr>
                       <a:picLocks noChangeAspect="1"/>
                     </pic:cNvPicPr>
@@ -3208,7 +2240,272 @@
                   <pic:spPr>
                     <a:xfrm>
                       <a:off x="0" y="0"/>
-                      <a:ext cx="170815" cy="168553"/>
+                      <a:ext cx="170815" cy="168275"/>
+                    </a:xfrm>
+                    <a:prstGeom prst="rect">
+                      <a:avLst/>
+                    </a:prstGeom>
+                  </pic:spPr>
+                </pic:pic>
+              </a:graphicData>
+            </a:graphic>
+          </wp:anchor>
+        </w:drawing>
+      </w:r>
+      <w:r>
+        <w:rPr>
+          <w:noProof/>
+          <w:vertAlign w:val="subscript"/>
+        </w:rPr>
+        <mc:AlternateContent>
+          <mc:Choice Requires="wps">
+            <w:drawing>
+              <wp:anchor distT="0" distB="0" distL="114300" distR="114300" simplePos="0" relativeHeight="251672576" behindDoc="0" locked="0" layoutInCell="1" allowOverlap="1" wp14:anchorId="683807B0" wp14:editId="488BCAFF">
+                <wp:simplePos x="0" y="0"/>
+                <wp:positionH relativeFrom="column">
+                  <wp:posOffset>190159</wp:posOffset>
+                </wp:positionH>
+                <wp:positionV relativeFrom="paragraph">
+                  <wp:posOffset>1236184</wp:posOffset>
+                </wp:positionV>
+                <wp:extent cx="1464310" cy="212090"/>
+                <wp:effectExtent l="0" t="0" r="0" b="0"/>
+                <wp:wrapNone/>
+                <wp:docPr id="1900646436" name="Text Box 12"/>
+                <wp:cNvGraphicFramePr/>
+                <a:graphic xmlns:a="http://schemas.openxmlformats.org/drawingml/2006/main">
+                  <a:graphicData uri="http://schemas.microsoft.com/office/word/2010/wordprocessingShape">
+                    <wps:wsp>
+                      <wps:cNvSpPr txBox="1"/>
+                      <wps:spPr>
+                        <a:xfrm>
+                          <a:off x="0" y="0"/>
+                          <a:ext cx="1464310" cy="212090"/>
+                        </a:xfrm>
+                        <a:prstGeom prst="rect">
+                          <a:avLst/>
+                        </a:prstGeom>
+                        <a:noFill/>
+                        <a:ln>
+                          <a:noFill/>
+                        </a:ln>
+                      </wps:spPr>
+                      <wps:style>
+                        <a:lnRef idx="0">
+                          <a:scrgbClr r="0" g="0" b="0"/>
+                        </a:lnRef>
+                        <a:fillRef idx="0">
+                          <a:scrgbClr r="0" g="0" b="0"/>
+                        </a:fillRef>
+                        <a:effectRef idx="0">
+                          <a:scrgbClr r="0" g="0" b="0"/>
+                        </a:effectRef>
+                        <a:fontRef idx="minor">
+                          <a:schemeClr val="dk1"/>
+                        </a:fontRef>
+                      </wps:style>
+                      <wps:txbx>
+                        <w:txbxContent>
+                          <w:p>
+                            <w:r>
+                              <w:rPr>
+                                <w:sz w:val="17"/>
+                              </w:rPr>
+                              <w:t>09123456789</w:t>
+                            </w:r>
+                          </w:p>
+                        </w:txbxContent>
+                      </wps:txbx>
+                      <wps:bodyPr rot="0" spcFirstLastPara="0" vertOverflow="overflow" horzOverflow="overflow" vert="horz" wrap="square" lIns="91440" tIns="45720" rIns="91440" bIns="45720" numCol="1" spcCol="0" rtlCol="0" fromWordArt="0" anchor="t" anchorCtr="0" forceAA="0" compatLnSpc="1">
+                        <a:prstTxWarp prst="textNoShape">
+                          <a:avLst/>
+                        </a:prstTxWarp>
+                        <a:noAutofit/>
+                      </wps:bodyPr>
+                    </wps:wsp>
+                  </a:graphicData>
+                </a:graphic>
+                <wp14:sizeRelV relativeFrom="margin">
+                  <wp14:pctHeight>0</wp14:pctHeight>
+                </wp14:sizeRelV>
+              </wp:anchor>
+            </w:drawing>
+          </mc:Choice>
+          <mc:Fallback>
+            <w:pict>
+              <v:shape w14:anchorId="683807B0" id="_x0000_s1034" type="#_x0000_t202" style="position:absolute;left:0;text-align:left;margin-left:14.95pt;margin-top:97.35pt;width:115.3pt;height:16.7pt;z-index:251672576;visibility:visible;mso-wrap-style:square;mso-height-percent:0;mso-wrap-distance-left:9pt;mso-wrap-distance-top:0;mso-wrap-distance-right:9pt;mso-wrap-distance-bottom:0;mso-position-horizontal:absolute;mso-position-horizontal-relative:text;mso-position-vertical:absolute;mso-position-vertical-relative:text;mso-height-percent:0;mso-height-relative:margin;v-text-anchor:top" o:gfxdata="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" filled="f" stroked="f">
+                <v:textbox>
+                  <w:txbxContent>
+                    <w:p>
+                      <w:r>
+                        <w:rPr>
+                          <w:sz w:val="17"/>
+                        </w:rPr>
+                        <w:t>09123456789</w:t>
+                      </w:r>
+                    </w:p>
+                  </w:txbxContent>
+                </v:textbox>
+              </v:shape>
+            </w:pict>
+          </mc:Fallback>
+        </mc:AlternateContent>
+      </w:r>
+      <w:r>
+        <w:rPr>
+          <w:noProof/>
+          <w:vertAlign w:val="subscript"/>
+        </w:rPr>
+        <mc:AlternateContent>
+          <mc:Choice Requires="wps">
+            <w:drawing>
+              <wp:anchor distT="0" distB="0" distL="114300" distR="114300" simplePos="0" relativeHeight="251675648" behindDoc="0" locked="0" layoutInCell="1" allowOverlap="1" wp14:anchorId="35F76D3B" wp14:editId="70264D0B">
+                <wp:simplePos x="0" y="0"/>
+                <wp:positionH relativeFrom="column">
+                  <wp:posOffset>165621</wp:posOffset>
+                </wp:positionH>
+                <wp:positionV relativeFrom="paragraph">
+                  <wp:posOffset>2185025</wp:posOffset>
+                </wp:positionV>
+                <wp:extent cx="1838325" cy="271145"/>
+                <wp:effectExtent l="0" t="0" r="0" b="0"/>
+                <wp:wrapNone/>
+                <wp:docPr id="1733427467" name="Text Box 13"/>
+                <wp:cNvGraphicFramePr/>
+                <a:graphic xmlns:a="http://schemas.openxmlformats.org/drawingml/2006/main">
+                  <a:graphicData uri="http://schemas.microsoft.com/office/word/2010/wordprocessingShape">
+                    <wps:wsp>
+                      <wps:cNvSpPr txBox="1"/>
+                      <wps:spPr>
+                        <a:xfrm>
+                          <a:off x="0" y="0"/>
+                          <a:ext cx="1838325" cy="271145"/>
+                        </a:xfrm>
+                        <a:prstGeom prst="rect">
+                          <a:avLst/>
+                        </a:prstGeom>
+                        <a:noFill/>
+                        <a:ln>
+                          <a:noFill/>
+                        </a:ln>
+                      </wps:spPr>
+                      <wps:style>
+                        <a:lnRef idx="0">
+                          <a:scrgbClr r="0" g="0" b="0"/>
+                        </a:lnRef>
+                        <a:fillRef idx="0">
+                          <a:scrgbClr r="0" g="0" b="0"/>
+                        </a:fillRef>
+                        <a:effectRef idx="0">
+                          <a:scrgbClr r="0" g="0" b="0"/>
+                        </a:effectRef>
+                        <a:fontRef idx="minor">
+                          <a:schemeClr val="dk1"/>
+                        </a:fontRef>
+                      </wps:style>
+                      <wps:txbx>
+                        <w:txbxContent>
+                          <w:p>
+                            <w:pPr>
+                              <w:pStyle w:val="ContactInfo"/>
+                            </w:pPr>
+                            <w:r>
+                              <w:rPr>
+                                <w:sz w:val="17"/>
+                              </w:rPr>
+                              <w:t>https://github.com/Shu0405-Ghost</w:t>
+                            </w:r>
+                          </w:p>
+                          <w:p/>
+                        </w:txbxContent>
+                      </wps:txbx>
+                      <wps:bodyPr rot="0" spcFirstLastPara="0" vertOverflow="overflow" horzOverflow="overflow" vert="horz" wrap="square" lIns="91440" tIns="45720" rIns="91440" bIns="45720" numCol="1" spcCol="0" rtlCol="0" fromWordArt="0" anchor="t" anchorCtr="0" forceAA="0" compatLnSpc="1">
+                        <a:prstTxWarp prst="textNoShape">
+                          <a:avLst/>
+                        </a:prstTxWarp>
+                        <a:noAutofit/>
+                      </wps:bodyPr>
+                    </wps:wsp>
+                  </a:graphicData>
+                </a:graphic>
+                <wp14:sizeRelH relativeFrom="margin">
+                  <wp14:pctWidth>0</wp14:pctWidth>
+                </wp14:sizeRelH>
+                <wp14:sizeRelV relativeFrom="margin">
+                  <wp14:pctHeight>0</wp14:pctHeight>
+                </wp14:sizeRelV>
+              </wp:anchor>
+            </w:drawing>
+          </mc:Choice>
+          <mc:Fallback>
+            <w:pict>
+              <v:shape w14:anchorId="35F76D3B" id="_x0000_s1035" type="#_x0000_t202" style="position:absolute;left:0;text-align:left;margin-left:13.05pt;margin-top:172.05pt;width:144.75pt;height:21.35pt;z-index:251675648;visibility:visible;mso-wrap-style:square;mso-width-percent:0;mso-height-percent:0;mso-wrap-distance-left:9pt;mso-wrap-distance-top:0;mso-wrap-distance-right:9pt;mso-wrap-distance-bottom:0;mso-position-horizontal:absolute;mso-position-horizontal-relative:text;mso-position-vertical:absolute;mso-position-vertical-relative:text;mso-width-percent:0;mso-height-percent:0;mso-width-relative:margin;mso-height-relative:margin;v-text-anchor:top" o:gfxdata="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" filled="f" stroked="f">
+                <v:textbox>
+                  <w:txbxContent>
+                    <w:p>
+                      <w:pPr>
+                        <w:pStyle w:val="ContactInfo"/>
+                      </w:pPr>
+                      <w:r>
+                        <w:rPr>
+                          <w:sz w:val="17"/>
+                        </w:rPr>
+                        <w:t>https://github.com/Shu0405-Ghost</w:t>
+                      </w:r>
+                    </w:p>
+                    <w:p/>
+                  </w:txbxContent>
+                </v:textbox>
+              </v:shape>
+            </w:pict>
+          </mc:Fallback>
+        </mc:AlternateContent>
+      </w:r>
+      <w:r>
+        <w:rPr>
+          <w:noProof/>
+          <w:vertAlign w:val="subscript"/>
+        </w:rPr>
+        <w:drawing>
+          <wp:anchor distT="0" distB="0" distL="114300" distR="114300" simplePos="0" relativeHeight="251664384" behindDoc="0" locked="0" layoutInCell="1" allowOverlap="1" wp14:anchorId="08668C52" wp14:editId="6121D9DD">
+            <wp:simplePos x="0" y="0"/>
+            <wp:positionH relativeFrom="margin">
+              <wp:align>left</wp:align>
+            </wp:positionH>
+            <wp:positionV relativeFrom="paragraph">
+              <wp:posOffset>2219164</wp:posOffset>
+            </wp:positionV>
+            <wp:extent cx="165735" cy="168275"/>
+            <wp:effectExtent l="0" t="0" r="5715" b="3175"/>
+            <wp:wrapNone/>
+            <wp:docPr id="441743469" name="Graphic 24"/>
+            <wp:cNvGraphicFramePr>
+              <a:graphicFrameLocks xmlns:a="http://schemas.openxmlformats.org/drawingml/2006/main" noChangeAspect="1"/>
+            </wp:cNvGraphicFramePr>
+            <a:graphic xmlns:a="http://schemas.openxmlformats.org/drawingml/2006/main">
+              <a:graphicData uri="http://schemas.openxmlformats.org/drawingml/2006/picture">
+                <pic:pic xmlns:pic="http://schemas.openxmlformats.org/drawingml/2006/picture">
+                  <pic:nvPicPr>
+                    <pic:cNvPr id="441743469" name="Graphic 24"/>
+                    <pic:cNvPicPr>
+                      <a:picLocks noChangeAspect="1"/>
+                    </pic:cNvPicPr>
+                  </pic:nvPicPr>
+                  <pic:blipFill>
+                    <a:blip r:embed="rId17">
+                      <a:extLst>
+                        <a:ext uri="{96DAC541-7B7A-43D3-8B79-37D633B846F1}">
+                          <asvg:svgBlip xmlns:asvg="http://schemas.microsoft.com/office/drawing/2016/SVG/main" r:embed="rId18"/>
+                        </a:ext>
+                      </a:extLst>
+                    </a:blip>
+                    <a:srcRect/>
+                    <a:stretch/>
+                  </pic:blipFill>
+                  <pic:spPr>
+                    <a:xfrm>
+                      <a:off x="0" y="0"/>
+                      <a:ext cx="165735" cy="168275"/>
                     </a:xfrm>
                     <a:prstGeom prst="rect">
                       <a:avLst/>
@@ -3226,18 +2523,18 @@
           <w:vertAlign w:val="subscript"/>
         </w:rPr>
         <w:drawing>
-          <wp:anchor distT="0" distB="0" distL="114300" distR="114300" simplePos="0" relativeHeight="251702272" behindDoc="0" locked="0" layoutInCell="1" allowOverlap="1" wp14:anchorId="58FD7C6A" wp14:editId="64E9C64A">
+          <wp:anchor distT="0" distB="0" distL="114300" distR="114300" simplePos="0" relativeHeight="251661312" behindDoc="0" locked="0" layoutInCell="1" allowOverlap="1" wp14:anchorId="6AAFD657" wp14:editId="76BEA663">
             <wp:simplePos x="0" y="0"/>
-            <wp:positionH relativeFrom="column">
-              <wp:posOffset>-44450</wp:posOffset>
+            <wp:positionH relativeFrom="margin">
+              <wp:align>left</wp:align>
             </wp:positionH>
             <wp:positionV relativeFrom="paragraph">
-              <wp:posOffset>2341458</wp:posOffset>
+              <wp:posOffset>1256030</wp:posOffset>
             </wp:positionV>
-            <wp:extent cx="170815" cy="168553"/>
+            <wp:extent cx="170815" cy="168275"/>
             <wp:effectExtent l="0" t="0" r="635" b="3175"/>
-            <wp:wrapSquare wrapText="bothSides"/>
-            <wp:docPr id="468311472" name="Graphic 23"/>
+            <wp:wrapNone/>
+            <wp:docPr id="1935713608" name="Graphic 19"/>
             <wp:cNvGraphicFramePr>
               <a:graphicFrameLocks xmlns:a="http://schemas.openxmlformats.org/drawingml/2006/main" noChangeAspect="1"/>
             </wp:cNvGraphicFramePr>
@@ -3245,19 +2542,19 @@
               <a:graphicData uri="http://schemas.openxmlformats.org/drawingml/2006/picture">
                 <pic:pic xmlns:pic="http://schemas.openxmlformats.org/drawingml/2006/picture">
                   <pic:nvPicPr>
-                    <pic:cNvPr id="468311472" name="Graphic 23"/>
+                    <pic:cNvPr id="1935713608" name="Graphic 19"/>
                     <pic:cNvPicPr>
                       <a:picLocks noChangeAspect="1"/>
                     </pic:cNvPicPr>
                   </pic:nvPicPr>
                   <pic:blipFill>
-                    <a:blip r:embed="rId17" cstate="print">
+                    <a:blip r:embed="rId19" cstate="print">
                       <a:extLst>
                         <a:ext uri="{28A0092B-C50C-407E-A947-70E740481C1C}">
                           <a14:useLocalDpi xmlns:a14="http://schemas.microsoft.com/office/drawing/2010/main" val="0"/>
                         </a:ext>
                         <a:ext uri="{96DAC541-7B7A-43D3-8B79-37D633B846F1}">
-                          <asvg:svgBlip xmlns:asvg="http://schemas.microsoft.com/office/drawing/2016/SVG/main" r:embed="rId18"/>
+                          <asvg:svgBlip xmlns:asvg="http://schemas.microsoft.com/office/drawing/2016/SVG/main" r:embed="rId20"/>
                         </a:ext>
                       </a:extLst>
                     </a:blip>
@@ -3268,7 +2565,7 @@
                   <pic:spPr>
                     <a:xfrm>
                       <a:off x="0" y="0"/>
-                      <a:ext cx="170815" cy="168553"/>
+                      <a:ext cx="170815" cy="168275"/>
                     </a:xfrm>
                     <a:prstGeom prst="rect">
                       <a:avLst/>
@@ -3285,60 +2582,458 @@
           <w:noProof/>
           <w:vertAlign w:val="subscript"/>
         </w:rPr>
-        <w:drawing>
-          <wp:anchor distT="0" distB="0" distL="114300" distR="114300" simplePos="0" relativeHeight="251703296" behindDoc="0" locked="0" layoutInCell="1" allowOverlap="1" wp14:anchorId="6412063A" wp14:editId="7768FDAA">
-            <wp:simplePos x="0" y="0"/>
-            <wp:positionH relativeFrom="column">
-              <wp:posOffset>-42210</wp:posOffset>
-            </wp:positionH>
-            <wp:positionV relativeFrom="paragraph">
-              <wp:posOffset>2669262</wp:posOffset>
-            </wp:positionV>
-            <wp:extent cx="166333" cy="168553"/>
-            <wp:effectExtent l="0" t="0" r="5715" b="3175"/>
-            <wp:wrapSquare wrapText="bothSides"/>
-            <wp:docPr id="441743469" name="Graphic 24"/>
-            <wp:cNvGraphicFramePr>
-              <a:graphicFrameLocks xmlns:a="http://schemas.openxmlformats.org/drawingml/2006/main" noChangeAspect="1"/>
-            </wp:cNvGraphicFramePr>
-            <a:graphic xmlns:a="http://schemas.openxmlformats.org/drawingml/2006/main">
-              <a:graphicData uri="http://schemas.openxmlformats.org/drawingml/2006/picture">
-                <pic:pic xmlns:pic="http://schemas.openxmlformats.org/drawingml/2006/picture">
-                  <pic:nvPicPr>
-                    <pic:cNvPr id="441743469" name="Graphic 24"/>
-                    <pic:cNvPicPr>
-                      <a:picLocks noChangeAspect="1"/>
-                    </pic:cNvPicPr>
-                  </pic:nvPicPr>
-                  <pic:blipFill>
-                    <a:blip r:embed="rId19">
-                      <a:extLst>
-                        <a:ext uri="{96DAC541-7B7A-43D3-8B79-37D633B846F1}">
-                          <asvg:svgBlip xmlns:asvg="http://schemas.microsoft.com/office/drawing/2016/SVG/main" r:embed="rId20"/>
-                        </a:ext>
-                      </a:extLst>
-                    </a:blip>
-                    <a:srcRect/>
-                    <a:stretch/>
-                  </pic:blipFill>
-                  <pic:spPr>
-                    <a:xfrm>
-                      <a:off x="0" y="0"/>
-                      <a:ext cx="166333" cy="168553"/>
-                    </a:xfrm>
-                    <a:prstGeom prst="rect">
-                      <a:avLst/>
-                    </a:prstGeom>
-                  </pic:spPr>
-                </pic:pic>
-              </a:graphicData>
-            </a:graphic>
-          </wp:anchor>
-        </w:drawing>
+        <mc:AlternateContent>
+          <mc:Choice Requires="wps">
+            <w:drawing>
+              <wp:anchor distT="0" distB="0" distL="114300" distR="114300" simplePos="0" relativeHeight="251671552" behindDoc="0" locked="0" layoutInCell="1" allowOverlap="1" wp14:anchorId="0B021B8E" wp14:editId="6AE7C62A">
+                <wp:simplePos x="0" y="0"/>
+                <wp:positionH relativeFrom="column">
+                  <wp:posOffset>4435475</wp:posOffset>
+                </wp:positionH>
+                <wp:positionV relativeFrom="paragraph">
+                  <wp:posOffset>7098665</wp:posOffset>
+                </wp:positionV>
+                <wp:extent cx="2159000" cy="615950"/>
+                <wp:effectExtent l="0" t="0" r="0" b="0"/>
+                <wp:wrapNone/>
+                <wp:docPr id="1270361470" name="Text Box 3"/>
+                <wp:cNvGraphicFramePr/>
+                <a:graphic xmlns:a="http://schemas.openxmlformats.org/drawingml/2006/main">
+                  <a:graphicData uri="http://schemas.microsoft.com/office/word/2010/wordprocessingShape">
+                    <wps:wsp>
+                      <wps:cNvSpPr txBox="1"/>
+                      <wps:spPr>
+                        <a:xfrm>
+                          <a:off x="0" y="0"/>
+                          <a:ext cx="2159000" cy="615950"/>
+                        </a:xfrm>
+                        <a:prstGeom prst="rect">
+                          <a:avLst/>
+                        </a:prstGeom>
+                        <a:solidFill>
+                          <a:schemeClr val="lt1"/>
+                        </a:solidFill>
+                        <a:ln w="6350">
+                          <a:noFill/>
+                        </a:ln>
+                      </wps:spPr>
+                      <wps:txbx>
+                        <w:txbxContent>
+                          <w:p>
+                            <w:pPr>
+                              <w:pStyle w:val="ListBullet"/>
+                              <w:numPr>
+                                <w:ilvl w:val="0"/>
+                                <w:numId w:val="0"/>
+                              </w:numPr>
+                              <w:ind w:left="720" w:hanging="360"/>
+                              <w:rPr>
+                                <w:szCs w:val="22"/>
+                              </w:rPr>
+                            </w:pPr>
+                            <w:r>
+                              <w:rPr>
+                                <w:szCs w:val="22"/>
+                              </w:rPr>
+                              <w:t xml:space="preserve">Dean Seth DA. </w:t>
+                            </w:r>
+                            <w:proofErr w:type="spellStart"/>
+                            <w:proofErr w:type="gramStart"/>
+                            <w:r>
+                              <w:rPr>
+                                <w:szCs w:val="22"/>
+                              </w:rPr>
+                              <w:t>Nono,MSCS</w:t>
+                            </w:r>
+                            <w:proofErr w:type="spellEnd"/>
+                            <w:proofErr w:type="gramEnd"/>
+                          </w:p>
+                          <w:p>
+                            <w:pPr>
+                              <w:pStyle w:val="ListBullet"/>
+                              <w:numPr>
+                                <w:ilvl w:val="0"/>
+                                <w:numId w:val="0"/>
+                              </w:numPr>
+                              <w:ind w:left="720" w:hanging="360"/>
+                              <w:rPr>
+                                <w:szCs w:val="22"/>
+                              </w:rPr>
+                            </w:pPr>
+                            <w:r>
+                              <w:rPr>
+                                <w:szCs w:val="22"/>
+                              </w:rPr>
+                              <w:t>DEAN</w:t>
+                            </w:r>
+                            <w:r>
+                              <w:rPr>
+                                <w:szCs w:val="22"/>
+                              </w:rPr>
+                              <w:t>, CITE</w:t>
+                            </w:r>
+                          </w:p>
+                          <w:p>
+                            <w:pPr>
+                              <w:pStyle w:val="ListBullet"/>
+                              <w:numPr>
+                                <w:ilvl w:val="0"/>
+                                <w:numId w:val="0"/>
+                              </w:numPr>
+                              <w:ind w:left="720" w:hanging="360"/>
+                              <w:rPr>
+                                <w:szCs w:val="22"/>
+                              </w:rPr>
+                            </w:pPr>
+                            <w:r>
+                              <w:rPr>
+                                <w:szCs w:val="22"/>
+                              </w:rPr>
+                              <w:t>0</w:t>
+                            </w:r>
+                            <w:r>
+                              <w:rPr>
+                                <w:szCs w:val="22"/>
+                              </w:rPr>
+                              <w:t>9----------</w:t>
+                            </w:r>
+                          </w:p>
+                          <w:p/>
+                        </w:txbxContent>
+                      </wps:txbx>
+                      <wps:bodyPr rot="0" spcFirstLastPara="0" vertOverflow="overflow" horzOverflow="overflow" vert="horz" wrap="square" lIns="91440" tIns="45720" rIns="91440" bIns="45720" numCol="1" spcCol="0" rtlCol="0" fromWordArt="0" anchor="t" anchorCtr="0" forceAA="0" compatLnSpc="1">
+                        <a:prstTxWarp prst="textNoShape">
+                          <a:avLst/>
+                        </a:prstTxWarp>
+                        <a:noAutofit/>
+                      </wps:bodyPr>
+                    </wps:wsp>
+                  </a:graphicData>
+                </a:graphic>
+                <wp14:sizeRelH relativeFrom="margin">
+                  <wp14:pctWidth>0</wp14:pctWidth>
+                </wp14:sizeRelH>
+                <wp14:sizeRelV relativeFrom="margin">
+                  <wp14:pctHeight>0</wp14:pctHeight>
+                </wp14:sizeRelV>
+              </wp:anchor>
+            </w:drawing>
+          </mc:Choice>
+          <mc:Fallback>
+            <w:pict>
+              <v:shape w14:anchorId="0B021B8E" id="Text Box 3" o:spid="_x0000_s1036" type="#_x0000_t202" style="position:absolute;left:0;text-align:left;margin-left:349.25pt;margin-top:558.95pt;width:170pt;height:48.5pt;z-index:251671552;visibility:visible;mso-wrap-style:square;mso-width-percent:0;mso-height-percent:0;mso-wrap-distance-left:9pt;mso-wrap-distance-top:0;mso-wrap-distance-right:9pt;mso-wrap-distance-bottom:0;mso-position-horizontal:absolute;mso-position-horizontal-relative:text;mso-position-vertical:absolute;mso-position-vertical-relative:text;mso-width-percent:0;mso-height-percent:0;mso-width-relative:margin;mso-height-relative:margin;v-text-anchor:top" o:gfxdata="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" fillcolor="white [3201]" stroked="f" strokeweight=".5pt">
+                <v:textbox>
+                  <w:txbxContent>
+                    <w:p>
+                      <w:pPr>
+                        <w:pStyle w:val="ListBullet"/>
+                        <w:numPr>
+                          <w:ilvl w:val="0"/>
+                          <w:numId w:val="0"/>
+                        </w:numPr>
+                        <w:ind w:left="720" w:hanging="360"/>
+                        <w:rPr>
+                          <w:szCs w:val="22"/>
+                        </w:rPr>
+                      </w:pPr>
+                      <w:r>
+                        <w:rPr>
+                          <w:szCs w:val="22"/>
+                        </w:rPr>
+                        <w:t xml:space="preserve">Dean Seth DA. </w:t>
+                      </w:r>
+                      <w:proofErr w:type="spellStart"/>
+                      <w:proofErr w:type="gramStart"/>
+                      <w:r>
+                        <w:rPr>
+                          <w:szCs w:val="22"/>
+                        </w:rPr>
+                        <w:t>Nono,MSCS</w:t>
+                      </w:r>
+                      <w:proofErr w:type="spellEnd"/>
+                      <w:proofErr w:type="gramEnd"/>
+                    </w:p>
+                    <w:p>
+                      <w:pPr>
+                        <w:pStyle w:val="ListBullet"/>
+                        <w:numPr>
+                          <w:ilvl w:val="0"/>
+                          <w:numId w:val="0"/>
+                        </w:numPr>
+                        <w:ind w:left="720" w:hanging="360"/>
+                        <w:rPr>
+                          <w:szCs w:val="22"/>
+                        </w:rPr>
+                      </w:pPr>
+                      <w:r>
+                        <w:rPr>
+                          <w:szCs w:val="22"/>
+                        </w:rPr>
+                        <w:t>DEAN</w:t>
+                      </w:r>
+                      <w:r>
+                        <w:rPr>
+                          <w:szCs w:val="22"/>
+                        </w:rPr>
+                        <w:t>, CITE</w:t>
+                      </w:r>
+                    </w:p>
+                    <w:p>
+                      <w:pPr>
+                        <w:pStyle w:val="ListBullet"/>
+                        <w:numPr>
+                          <w:ilvl w:val="0"/>
+                          <w:numId w:val="0"/>
+                        </w:numPr>
+                        <w:ind w:left="720" w:hanging="360"/>
+                        <w:rPr>
+                          <w:szCs w:val="22"/>
+                        </w:rPr>
+                      </w:pPr>
+                      <w:r>
+                        <w:rPr>
+                          <w:szCs w:val="22"/>
+                        </w:rPr>
+                        <w:t>0</w:t>
+                      </w:r>
+                      <w:r>
+                        <w:rPr>
+                          <w:szCs w:val="22"/>
+                        </w:rPr>
+                        <w:t>9----------</w:t>
+                      </w:r>
+                    </w:p>
+                    <w:p/>
+                  </w:txbxContent>
+                </v:textbox>
+              </v:shape>
+            </w:pict>
+          </mc:Fallback>
+        </mc:AlternateContent>
+      </w:r>
+      <w:r>
+        <w:rPr>
+          <w:noProof/>
+          <w:vertAlign w:val="subscript"/>
+        </w:rPr>
+        <mc:AlternateContent>
+          <mc:Choice Requires="wps">
+            <w:drawing>
+              <wp:anchor distT="0" distB="0" distL="114300" distR="114300" simplePos="0" relativeHeight="251670528" behindDoc="0" locked="0" layoutInCell="1" allowOverlap="1" wp14:anchorId="58AA2035" wp14:editId="11A28146">
+                <wp:simplePos x="0" y="0"/>
+                <wp:positionH relativeFrom="column">
+                  <wp:posOffset>2209800</wp:posOffset>
+                </wp:positionH>
+                <wp:positionV relativeFrom="paragraph">
+                  <wp:posOffset>7101840</wp:posOffset>
+                </wp:positionV>
+                <wp:extent cx="1905000" cy="615950"/>
+                <wp:effectExtent l="0" t="0" r="0" b="0"/>
+                <wp:wrapNone/>
+                <wp:docPr id="2077883036" name="Text Box 3"/>
+                <wp:cNvGraphicFramePr/>
+                <a:graphic xmlns:a="http://schemas.openxmlformats.org/drawingml/2006/main">
+                  <a:graphicData uri="http://schemas.microsoft.com/office/word/2010/wordprocessingShape">
+                    <wps:wsp>
+                      <wps:cNvSpPr txBox="1"/>
+                      <wps:spPr>
+                        <a:xfrm>
+                          <a:off x="0" y="0"/>
+                          <a:ext cx="1905000" cy="615950"/>
+                        </a:xfrm>
+                        <a:prstGeom prst="rect">
+                          <a:avLst/>
+                        </a:prstGeom>
+                        <a:solidFill>
+                          <a:schemeClr val="lt1"/>
+                        </a:solidFill>
+                        <a:ln w="6350">
+                          <a:noFill/>
+                        </a:ln>
+                      </wps:spPr>
+                      <wps:txbx>
+                        <w:txbxContent>
+                          <w:p>
+                            <w:pPr>
+                              <w:pStyle w:val="ListBullet"/>
+                              <w:numPr>
+                                <w:ilvl w:val="0"/>
+                                <w:numId w:val="0"/>
+                              </w:numPr>
+                              <w:ind w:left="720" w:hanging="360"/>
+                              <w:rPr>
+                                <w:szCs w:val="22"/>
+                              </w:rPr>
+                            </w:pPr>
+                            <w:r>
+                              <w:rPr>
+                                <w:szCs w:val="22"/>
+                              </w:rPr>
+                              <w:t xml:space="preserve">Ms. </w:t>
+                            </w:r>
+                            <w:proofErr w:type="spellStart"/>
+                            <w:r>
+                              <w:rPr>
+                                <w:szCs w:val="22"/>
+                              </w:rPr>
+                              <w:t>Jocel</w:t>
+                            </w:r>
+                            <w:proofErr w:type="spellEnd"/>
+                            <w:r>
+                              <w:rPr>
+                                <w:szCs w:val="22"/>
+                              </w:rPr>
+                              <w:t xml:space="preserve"> C. Gallo, MBA</w:t>
+                            </w:r>
+                          </w:p>
+                          <w:p>
+                            <w:pPr>
+                              <w:pStyle w:val="ListBullet"/>
+                              <w:numPr>
+                                <w:ilvl w:val="0"/>
+                                <w:numId w:val="0"/>
+                              </w:numPr>
+                              <w:ind w:left="720" w:hanging="360"/>
+                              <w:rPr>
+                                <w:szCs w:val="22"/>
+                              </w:rPr>
+                            </w:pPr>
+                            <w:r>
+                              <w:rPr>
+                                <w:szCs w:val="22"/>
+                              </w:rPr>
+                              <w:t>Teacher, CITE</w:t>
+                            </w:r>
+                          </w:p>
+                          <w:p>
+                            <w:pPr>
+                              <w:pStyle w:val="ListBullet"/>
+                              <w:numPr>
+                                <w:ilvl w:val="0"/>
+                                <w:numId w:val="0"/>
+                              </w:numPr>
+                              <w:ind w:left="720" w:hanging="360"/>
+                              <w:rPr>
+                                <w:szCs w:val="22"/>
+                              </w:rPr>
+                            </w:pPr>
+                            <w:r>
+                              <w:rPr>
+                                <w:szCs w:val="22"/>
+                              </w:rPr>
+                              <w:t>09673060018</w:t>
+                            </w:r>
+                          </w:p>
+                          <w:p/>
+                        </w:txbxContent>
+                      </wps:txbx>
+                      <wps:bodyPr rot="0" spcFirstLastPara="0" vertOverflow="overflow" horzOverflow="overflow" vert="horz" wrap="square" lIns="91440" tIns="45720" rIns="91440" bIns="45720" numCol="1" spcCol="0" rtlCol="0" fromWordArt="0" anchor="t" anchorCtr="0" forceAA="0" compatLnSpc="1">
+                        <a:prstTxWarp prst="textNoShape">
+                          <a:avLst/>
+                        </a:prstTxWarp>
+                        <a:noAutofit/>
+                      </wps:bodyPr>
+                    </wps:wsp>
+                  </a:graphicData>
+                </a:graphic>
+                <wp14:sizeRelH relativeFrom="margin">
+                  <wp14:pctWidth>0</wp14:pctWidth>
+                </wp14:sizeRelH>
+                <wp14:sizeRelV relativeFrom="margin">
+                  <wp14:pctHeight>0</wp14:pctHeight>
+                </wp14:sizeRelV>
+              </wp:anchor>
+            </w:drawing>
+          </mc:Choice>
+          <mc:Fallback>
+            <w:pict>
+              <v:shape w14:anchorId="58AA2035" id="_x0000_s1037" type="#_x0000_t202" style="position:absolute;left:0;text-align:left;margin-left:174pt;margin-top:559.2pt;width:150pt;height:48.5pt;z-index:251670528;visibility:visible;mso-wrap-style:square;mso-width-percent:0;mso-height-percent:0;mso-wrap-distance-left:9pt;mso-wrap-distance-top:0;mso-wrap-distance-right:9pt;mso-wrap-distance-bottom:0;mso-position-horizontal:absolute;mso-position-horizontal-relative:text;mso-position-vertical:absolute;mso-position-vertical-relative:text;mso-width-percent:0;mso-height-percent:0;mso-width-relative:margin;mso-height-relative:margin;v-text-anchor:top" o:gfxdata="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" fillcolor="white [3201]" stroked="f" strokeweight=".5pt">
+                <v:textbox>
+                  <w:txbxContent>
+                    <w:p>
+                      <w:pPr>
+                        <w:pStyle w:val="ListBullet"/>
+                        <w:numPr>
+                          <w:ilvl w:val="0"/>
+                          <w:numId w:val="0"/>
+                        </w:numPr>
+                        <w:ind w:left="720" w:hanging="360"/>
+                        <w:rPr>
+                          <w:szCs w:val="22"/>
+                        </w:rPr>
+                      </w:pPr>
+                      <w:r>
+                        <w:rPr>
+                          <w:szCs w:val="22"/>
+                        </w:rPr>
+                        <w:t xml:space="preserve">Ms. </w:t>
+                      </w:r>
+                      <w:proofErr w:type="spellStart"/>
+                      <w:r>
+                        <w:rPr>
+                          <w:szCs w:val="22"/>
+                        </w:rPr>
+                        <w:t>Jocel</w:t>
+                      </w:r>
+                      <w:proofErr w:type="spellEnd"/>
+                      <w:r>
+                        <w:rPr>
+                          <w:szCs w:val="22"/>
+                        </w:rPr>
+                        <w:t xml:space="preserve"> C. Gallo, MBA</w:t>
+                      </w:r>
+                    </w:p>
+                    <w:p>
+                      <w:pPr>
+                        <w:pStyle w:val="ListBullet"/>
+                        <w:numPr>
+                          <w:ilvl w:val="0"/>
+                          <w:numId w:val="0"/>
+                        </w:numPr>
+                        <w:ind w:left="720" w:hanging="360"/>
+                        <w:rPr>
+                          <w:szCs w:val="22"/>
+                        </w:rPr>
+                      </w:pPr>
+                      <w:r>
+                        <w:rPr>
+                          <w:szCs w:val="22"/>
+                        </w:rPr>
+                        <w:t>Teacher, CITE</w:t>
+                      </w:r>
+                    </w:p>
+                    <w:p>
+                      <w:pPr>
+                        <w:pStyle w:val="ListBullet"/>
+                        <w:numPr>
+                          <w:ilvl w:val="0"/>
+                          <w:numId w:val="0"/>
+                        </w:numPr>
+                        <w:ind w:left="720" w:hanging="360"/>
+                        <w:rPr>
+                          <w:szCs w:val="22"/>
+                        </w:rPr>
+                      </w:pPr>
+                      <w:r>
+                        <w:rPr>
+                          <w:szCs w:val="22"/>
+                        </w:rPr>
+                        <w:t>09673060018</w:t>
+                      </w:r>
+                    </w:p>
+                    <w:p/>
+                  </w:txbxContent>
+                </v:textbox>
+              </v:shape>
+            </w:pict>
+          </mc:Fallback>
+        </mc:AlternateContent>
       </w:r>
     </w:p>
+    <w:p/>
+    <w:p/>
     <w:sectPr>
-      <w:pgSz w:w="12240" w:h="15840" w:code="1"/>
+      <w:pgSz w:w="11906" w:h="16838" w:code="9"/>
       <w:pgMar w:top="360" w:right="720" w:bottom="720" w:left="720" w:header="706" w:footer="706" w:gutter="0"/>
       <w:cols w:space="708"/>
       <w:docGrid w:linePitch="360"/>
@@ -3352,7 +3047,7 @@
   <w:abstractNum w:abstractNumId="0" w15:restartNumberingAfterBreak="0">
     <w:nsid w:val="FFFFFF89"/>
     <w:multiLevelType w:val="singleLevel"/>
-    <w:tmpl w:val="62BA06FA"/>
+    <w:tmpl w:val="01321DD8"/>
     <w:lvl w:ilvl="0">
       <w:start w:val="1"/>
       <w:numFmt w:val="bullet"/>
@@ -4785,6 +4480,46 @@
 </file>
 
 <file path=customXml/item1.xml><?xml version="1.0" encoding="utf-8"?>
+<?mso-contentType ?>
+<FormTemplates xmlns="http://schemas.microsoft.com/sharepoint/v3/contenttype/forms">
+  <Display>DocumentLibraryForm</Display>
+  <Edit>DocumentLibraryForm</Edit>
+  <New>DocumentLibraryForm</New>
+</FormTemplates>
+</file>
+
+<file path=customXml/item2.xml><?xml version="1.0" encoding="utf-8"?>
+<p:properties xmlns:p="http://schemas.microsoft.com/office/2006/metadata/properties" xmlns:xsi="http://www.w3.org/2001/XMLSchema-instance" xmlns:pc="http://schemas.microsoft.com/office/infopath/2007/PartnerControls">
+  <documentManagement>
+    <_ip_UnifiedCompliancePolicyUIAction xmlns="http://schemas.microsoft.com/sharepoint/v3" xsi:nil="true"/>
+    <_ip_UnifiedCompliancePolicyProperties xmlns="http://schemas.microsoft.com/sharepoint/v3" xsi:nil="true"/>
+    <TaxCatchAll xmlns="230e9df3-be65-4c73-a93b-d1236ebd677e" xsi:nil="true"/>
+    <ImageTagsTaxHTField xmlns="71af3243-3dd4-4a8d-8c0d-dd76da1f02a5">
+      <Terms xmlns="http://schemas.microsoft.com/office/infopath/2007/PartnerControls"/>
+    </ImageTagsTaxHTField>
+    <Image xmlns="71af3243-3dd4-4a8d-8c0d-dd76da1f02a5">
+      <Url xsi:nil="true"/>
+      <Description xsi:nil="true"/>
+    </Image>
+    <Status xmlns="71af3243-3dd4-4a8d-8c0d-dd76da1f02a5">Not started</Status>
+    <Background xmlns="71af3243-3dd4-4a8d-8c0d-dd76da1f02a5">false</Background>
+    <MediaServiceKeyPoints xmlns="71af3243-3dd4-4a8d-8c0d-dd76da1f02a5" xsi:nil="true"/>
+    <SharedWithUsers xmlns="16c05727-aa75-4e4a-9b5f-8a80a1165891">
+      <UserInfo>
+        <DisplayName/>
+        <AccountId xsi:nil="true"/>
+        <AccountType/>
+      </UserInfo>
+    </SharedWithUsers>
+  </documentManagement>
+</p:properties>
+</file>
+
+<file path=customXml/item3.xml><?xml version="1.0" encoding="utf-8"?>
+<b:Sources xmlns:b="http://schemas.openxmlformats.org/officeDocument/2006/bibliography" xmlns="http://schemas.openxmlformats.org/officeDocument/2006/bibliography" SelectedStyle="\APASixthEditionOfficeOnline.xsl" StyleName="APA" Version="6"/>
+</file>
+
+<file path=customXml/item4.xml><?xml version="1.0" encoding="utf-8"?>
 <ct:contentTypeSchema xmlns:ct="http://schemas.microsoft.com/office/2006/metadata/contentType" xmlns:ma="http://schemas.microsoft.com/office/2006/metadata/properties/metaAttributes" ct:_="" ma:_="" ma:contentTypeName="Document" ma:contentTypeID="0x01010079F111ED35F8CC479449609E8A0923A6" ma:contentTypeVersion="30" ma:contentTypeDescription="Create a new document." ma:contentTypeScope="" ma:versionID="cec0622158e8f13124e9e8fd4de31bd1">
   <xsd:schema xmlns:xsd="http://www.w3.org/2001/XMLSchema" xmlns:xs="http://www.w3.org/2001/XMLSchema" xmlns:p="http://schemas.microsoft.com/office/2006/metadata/properties" xmlns:ns1="http://schemas.microsoft.com/sharepoint/v3" xmlns:ns2="71af3243-3dd4-4a8d-8c0d-dd76da1f02a5" xmlns:ns3="16c05727-aa75-4e4a-9b5f-8a80a1165891" xmlns:ns4="230e9df3-be65-4c73-a93b-d1236ebd677e" targetNamespace="http://schemas.microsoft.com/office/2006/metadata/properties" ma:root="true" ma:fieldsID="3b52f30ab005d15df08657af532e6e38" ns1:_="" ns2:_="" ns3:_="" ns4:_="">
     <xsd:import namespace="http://schemas.microsoft.com/sharepoint/v3"/>
@@ -5102,47 +4837,36 @@
 </ct:contentTypeSchema>
 </file>
 
-<file path=customXml/item2.xml><?xml version="1.0" encoding="utf-8"?>
-<?mso-contentType ?>
-<FormTemplates xmlns="http://schemas.microsoft.com/sharepoint/v3/contenttype/forms">
-  <Display>DocumentLibraryForm</Display>
-  <Edit>DocumentLibraryForm</Edit>
-  <New>DocumentLibraryForm</New>
-</FormTemplates>
+<file path=customXml/itemProps1.xml><?xml version="1.0" encoding="utf-8"?>
+<ds:datastoreItem xmlns:ds="http://schemas.openxmlformats.org/officeDocument/2006/customXml" ds:itemID="{F8699671-72DE-4DE8-9995-CB14096EB6BE}">
+  <ds:schemaRefs>
+    <ds:schemaRef ds:uri="http://schemas.microsoft.com/sharepoint/v3/contenttype/forms"/>
+  </ds:schemaRefs>
+</ds:datastoreItem>
 </file>
 
-<file path=customXml/item3.xml><?xml version="1.0" encoding="utf-8"?>
-<p:properties xmlns:p="http://schemas.microsoft.com/office/2006/metadata/properties" xmlns:xsi="http://www.w3.org/2001/XMLSchema-instance" xmlns:pc="http://schemas.microsoft.com/office/infopath/2007/PartnerControls">
-  <documentManagement>
-    <_ip_UnifiedCompliancePolicyUIAction xmlns="http://schemas.microsoft.com/sharepoint/v3" xsi:nil="true"/>
-    <_ip_UnifiedCompliancePolicyProperties xmlns="http://schemas.microsoft.com/sharepoint/v3" xsi:nil="true"/>
-    <TaxCatchAll xmlns="230e9df3-be65-4c73-a93b-d1236ebd677e" xsi:nil="true"/>
-    <ImageTagsTaxHTField xmlns="71af3243-3dd4-4a8d-8c0d-dd76da1f02a5">
-      <Terms xmlns="http://schemas.microsoft.com/office/infopath/2007/PartnerControls"/>
-    </ImageTagsTaxHTField>
-    <Image xmlns="71af3243-3dd4-4a8d-8c0d-dd76da1f02a5">
-      <Url xsi:nil="true"/>
-      <Description xsi:nil="true"/>
-    </Image>
-    <Status xmlns="71af3243-3dd4-4a8d-8c0d-dd76da1f02a5">Not started</Status>
-    <Background xmlns="71af3243-3dd4-4a8d-8c0d-dd76da1f02a5">false</Background>
-    <MediaServiceKeyPoints xmlns="71af3243-3dd4-4a8d-8c0d-dd76da1f02a5" xsi:nil="true"/>
-    <SharedWithUsers xmlns="16c05727-aa75-4e4a-9b5f-8a80a1165891">
-      <UserInfo>
-        <DisplayName/>
-        <AccountId xsi:nil="true"/>
-        <AccountType/>
-      </UserInfo>
-    </SharedWithUsers>
-  </documentManagement>
-</p:properties>
+<file path=customXml/itemProps2.xml><?xml version="1.0" encoding="utf-8"?>
+<ds:datastoreItem xmlns:ds="http://schemas.openxmlformats.org/officeDocument/2006/customXml" ds:itemID="{BE71A2AA-C2C2-45EF-9CEB-115274F5DFE8}">
+  <ds:schemaRefs>
+    <ds:schemaRef ds:uri="http://schemas.microsoft.com/office/2006/metadata/properties"/>
+    <ds:schemaRef ds:uri="http://schemas.microsoft.com/office/infopath/2007/PartnerControls"/>
+    <ds:schemaRef ds:uri="http://schemas.microsoft.com/sharepoint/v3"/>
+    <ds:schemaRef ds:uri="230e9df3-be65-4c73-a93b-d1236ebd677e"/>
+    <ds:schemaRef ds:uri="71af3243-3dd4-4a8d-8c0d-dd76da1f02a5"/>
+    <ds:schemaRef ds:uri="16c05727-aa75-4e4a-9b5f-8a80a1165891"/>
+  </ds:schemaRefs>
+</ds:datastoreItem>
 </file>
 
-<file path=customXml/item4.xml><?xml version="1.0" encoding="utf-8"?>
-<b:Sources xmlns:b="http://schemas.openxmlformats.org/officeDocument/2006/bibliography" xmlns="http://schemas.openxmlformats.org/officeDocument/2006/bibliography" SelectedStyle="\APASixthEditionOfficeOnline.xsl" StyleName="APA" Version="6"/>
+<file path=customXml/itemProps3.xml><?xml version="1.0" encoding="utf-8"?>
+<ds:datastoreItem xmlns:ds="http://schemas.openxmlformats.org/officeDocument/2006/customXml" ds:itemID="{C6809C35-722C-423A-8C94-619EC051D659}">
+  <ds:schemaRefs>
+    <ds:schemaRef ds:uri="http://schemas.openxmlformats.org/officeDocument/2006/bibliography"/>
+  </ds:schemaRefs>
+</ds:datastoreItem>
 </file>
 
-<file path=customXml/itemProps1.xml><?xml version="1.0" encoding="utf-8"?>
+<file path=customXml/itemProps4.xml><?xml version="1.0" encoding="utf-8"?>
 <ds:datastoreItem xmlns:ds="http://schemas.openxmlformats.org/officeDocument/2006/customXml" ds:itemID="{A561FEBE-91A1-4154-B6E6-5DDE7646706C}">
   <ds:schemaRefs>
     <ds:schemaRef ds:uri="http://schemas.microsoft.com/office/2006/metadata/contentType"/>
@@ -5163,35 +4887,6 @@
 </ds:datastoreItem>
 </file>
 
-<file path=customXml/itemProps2.xml><?xml version="1.0" encoding="utf-8"?>
-<ds:datastoreItem xmlns:ds="http://schemas.openxmlformats.org/officeDocument/2006/customXml" ds:itemID="{F8699671-72DE-4DE8-9995-CB14096EB6BE}">
-  <ds:schemaRefs>
-    <ds:schemaRef ds:uri="http://schemas.microsoft.com/sharepoint/v3/contenttype/forms"/>
-  </ds:schemaRefs>
-</ds:datastoreItem>
-</file>
-
-<file path=customXml/itemProps3.xml><?xml version="1.0" encoding="utf-8"?>
-<ds:datastoreItem xmlns:ds="http://schemas.openxmlformats.org/officeDocument/2006/customXml" ds:itemID="{BE71A2AA-C2C2-45EF-9CEB-115274F5DFE8}">
-  <ds:schemaRefs>
-    <ds:schemaRef ds:uri="http://schemas.microsoft.com/office/2006/metadata/properties"/>
-    <ds:schemaRef ds:uri="http://schemas.microsoft.com/office/infopath/2007/PartnerControls"/>
-    <ds:schemaRef ds:uri="http://schemas.microsoft.com/sharepoint/v3"/>
-    <ds:schemaRef ds:uri="230e9df3-be65-4c73-a93b-d1236ebd677e"/>
-    <ds:schemaRef ds:uri="71af3243-3dd4-4a8d-8c0d-dd76da1f02a5"/>
-    <ds:schemaRef ds:uri="16c05727-aa75-4e4a-9b5f-8a80a1165891"/>
-  </ds:schemaRefs>
-</ds:datastoreItem>
-</file>
-
-<file path=customXml/itemProps4.xml><?xml version="1.0" encoding="utf-8"?>
-<ds:datastoreItem xmlns:ds="http://schemas.openxmlformats.org/officeDocument/2006/customXml" ds:itemID="{C6809C35-722C-423A-8C94-619EC051D659}">
-  <ds:schemaRefs>
-    <ds:schemaRef ds:uri="http://schemas.openxmlformats.org/officeDocument/2006/bibliography"/>
-  </ds:schemaRefs>
-</ds:datastoreItem>
-</file>
-
 <file path=docMetadata/LabelInfo.xml><?xml version="1.0" encoding="utf-8"?>
 <clbl:labelList xmlns:clbl="http://schemas.microsoft.com/office/2020/mipLabelMetadata"/>
 </file>
</xml_diff>